<commit_message>
PDF of deviation table
</commit_message>
<xml_diff>
--- a/Tables/table-s1_Exploratory-Prereg_Deviation-Table.docx
+++ b/Tables/table-s1_Exploratory-Prereg_Deviation-Table.docx
@@ -4200,13 +4200,14 @@
       </w:tr>
       <w:tr>
         <w:trPr>
-          <w:trHeight w:val="20"/>
+          <w:trHeight w:val="440"/>
         </w:trPr>
         <w:tc>
           <w:tcPr>
-            <w:tcW w:w="270" w:type="dxa"/>
-            <w:vMerge w:val="restart"/>
-            <w:tcBorders>
+            <w:tcW w:w="14310" w:type="dxa"/>
+            <w:gridSpan w:val="6"/>
+            <w:tcBorders>
+              <w:top w:val="single" w:sz="18" w:space="0" w:color="000000"/>
               <w:left w:val="nil"/>
             </w:tcBorders>
             <w:tcMar>
@@ -4222,1943 +4223,16 @@
               <w:spacing w:line="240" w:lineRule="auto"/>
               <w:rPr>
                 <w:rFonts w:ascii="Garamond" w:eastAsia="Times New Roman" w:hAnsi="Garamond" w:cs="Times New Roman"/>
-              </w:rPr>
-            </w:pPr>
-            <w:r>
-              <w:rPr>
-                <w:rFonts w:ascii="Garamond" w:eastAsia="Times New Roman" w:hAnsi="Garamond" w:cs="Times New Roman"/>
-              </w:rPr>
-              <w:t>3</w:t>
-            </w:r>
-          </w:p>
-        </w:tc>
-        <w:tc>
-          <w:tcPr>
-            <w:tcW w:w="1020" w:type="dxa"/>
-            <w:tcMar>
-              <w:top w:w="100" w:type="dxa"/>
-              <w:left w:w="100" w:type="dxa"/>
-              <w:bottom w:w="100" w:type="dxa"/>
-              <w:right w:w="100" w:type="dxa"/>
-            </w:tcMar>
-          </w:tcPr>
-          <w:p>
-            <w:pPr>
-              <w:widowControl w:val="0"/>
-              <w:spacing w:line="240" w:lineRule="auto"/>
-              <w:rPr>
-                <w:rFonts w:ascii="Garamond" w:eastAsia="Times New Roman" w:hAnsi="Garamond" w:cs="Times New Roman"/>
-              </w:rPr>
-            </w:pPr>
-            <w:r>
-              <w:rPr>
-                <w:rFonts w:ascii="Garamond" w:eastAsia="Times New Roman" w:hAnsi="Garamond" w:cs="Times New Roman"/>
-              </w:rPr>
-              <w:t>Type</w:t>
-            </w:r>
-          </w:p>
-        </w:tc>
-        <w:tc>
-          <w:tcPr>
-            <w:tcW w:w="1920" w:type="dxa"/>
-            <w:tcMar>
-              <w:top w:w="100" w:type="dxa"/>
-              <w:left w:w="100" w:type="dxa"/>
-              <w:bottom w:w="100" w:type="dxa"/>
-              <w:right w:w="100" w:type="dxa"/>
-            </w:tcMar>
-          </w:tcPr>
-          <w:p>
-            <w:pPr>
-              <w:widowControl w:val="0"/>
-              <w:spacing w:line="240" w:lineRule="auto"/>
-              <w:rPr>
-                <w:rFonts w:ascii="Garamond" w:eastAsia="Times New Roman" w:hAnsi="Garamond" w:cs="Times New Roman"/>
-              </w:rPr>
-            </w:pPr>
-            <w:sdt>
-              <w:sdtPr>
-                <w:rPr>
-                  <w:rFonts w:ascii="Garamond" w:hAnsi="Garamond"/>
-                </w:rPr>
-                <w:alias w:val="Type"/>
-                <w:id w:val="1295024251"/>
-                <w:dropDownList>
-                  <w:listItem w:displayText="Select One" w:value="Select One"/>
-                  <w:listItem w:displayText="Study Design" w:value="Study Design"/>
-                  <w:listItem w:displayText="Sample" w:value="Sample"/>
-                  <w:listItem w:displayText="Research Q(s)" w:value="Research Q(s)"/>
-                  <w:listItem w:displayText="Hypotheses" w:value="Hypotheses"/>
-                  <w:listItem w:displayText="Variables" w:value="Variables"/>
-                  <w:listItem w:displayText="Analysis" w:value="Analysis"/>
-                  <w:listItem w:displayText="Covariates" w:value="Covariates"/>
-                  <w:listItem w:displayText="Inferential Criteria" w:value="Inferential Criteria"/>
-                  <w:listItem w:displayText="Data Preparation" w:value="Data Preparation"/>
-                  <w:listItem w:displayText="Other (Please Explain)" w:value="Other (Please Explain)"/>
-                </w:dropDownList>
-              </w:sdtPr>
-              <w:sdtContent>
-                <w:r>
-                  <w:rPr>
-                    <w:rFonts w:ascii="Garamond" w:eastAsia="Times New Roman" w:hAnsi="Garamond" w:cs="Times New Roman"/>
-                  </w:rPr>
-                  <w:t>Select One</w:t>
-                </w:r>
-              </w:sdtContent>
-            </w:sdt>
-          </w:p>
-        </w:tc>
-        <w:tc>
-          <w:tcPr>
-            <w:tcW w:w="4170" w:type="dxa"/>
-            <w:vMerge w:val="restart"/>
-          </w:tcPr>
-          <w:p>
-            <w:pPr>
-              <w:widowControl w:val="0"/>
-              <w:spacing w:line="240" w:lineRule="auto"/>
-              <w:rPr>
-                <w:rFonts w:ascii="Garamond" w:eastAsia="Times New Roman" w:hAnsi="Garamond" w:cs="Times New Roman"/>
-              </w:rPr>
-            </w:pPr>
-          </w:p>
-        </w:tc>
-        <w:tc>
-          <w:tcPr>
-            <w:tcW w:w="4050" w:type="dxa"/>
-            <w:vMerge w:val="restart"/>
-          </w:tcPr>
-          <w:p>
-            <w:pPr>
-              <w:widowControl w:val="0"/>
-              <w:spacing w:line="240" w:lineRule="auto"/>
-              <w:rPr>
-                <w:rFonts w:ascii="Garamond" w:eastAsia="Times New Roman" w:hAnsi="Garamond" w:cs="Times New Roman"/>
-              </w:rPr>
-            </w:pPr>
-          </w:p>
-        </w:tc>
-        <w:tc>
-          <w:tcPr>
-            <w:tcW w:w="2880" w:type="dxa"/>
-            <w:vMerge w:val="restart"/>
-            <w:tcBorders>
-              <w:right w:val="nil"/>
-            </w:tcBorders>
-            <w:tcMar>
-              <w:top w:w="100" w:type="dxa"/>
-              <w:left w:w="100" w:type="dxa"/>
-              <w:bottom w:w="100" w:type="dxa"/>
-              <w:right w:w="100" w:type="dxa"/>
-            </w:tcMar>
-          </w:tcPr>
-          <w:p>
-            <w:pPr>
-              <w:widowControl w:val="0"/>
-              <w:spacing w:line="240" w:lineRule="auto"/>
-              <w:rPr>
-                <w:rFonts w:ascii="Garamond" w:eastAsia="Times New Roman" w:hAnsi="Garamond" w:cs="Times New Roman"/>
-              </w:rPr>
-            </w:pPr>
-          </w:p>
-        </w:tc>
-      </w:tr>
-      <w:tr>
-        <w:trPr>
-          <w:trHeight w:val="20"/>
-        </w:trPr>
-        <w:tc>
-          <w:tcPr>
-            <w:tcW w:w="270" w:type="dxa"/>
-            <w:vMerge/>
-            <w:tcBorders>
-              <w:left w:val="nil"/>
-            </w:tcBorders>
-            <w:tcMar>
-              <w:top w:w="100" w:type="dxa"/>
-              <w:left w:w="100" w:type="dxa"/>
-              <w:bottom w:w="100" w:type="dxa"/>
-              <w:right w:w="100" w:type="dxa"/>
-            </w:tcMar>
-          </w:tcPr>
-          <w:p>
-            <w:pPr>
-              <w:widowControl w:val="0"/>
-              <w:spacing w:line="240" w:lineRule="auto"/>
-              <w:rPr>
-                <w:rFonts w:ascii="Garamond" w:eastAsia="Times New Roman" w:hAnsi="Garamond" w:cs="Times New Roman"/>
-              </w:rPr>
-            </w:pPr>
-          </w:p>
-        </w:tc>
-        <w:tc>
-          <w:tcPr>
-            <w:tcW w:w="1020" w:type="dxa"/>
-            <w:tcMar>
-              <w:top w:w="100" w:type="dxa"/>
-              <w:left w:w="100" w:type="dxa"/>
-              <w:bottom w:w="100" w:type="dxa"/>
-              <w:right w:w="100" w:type="dxa"/>
-            </w:tcMar>
-          </w:tcPr>
-          <w:p>
-            <w:pPr>
-              <w:widowControl w:val="0"/>
-              <w:spacing w:line="240" w:lineRule="auto"/>
-              <w:rPr>
-                <w:rFonts w:ascii="Garamond" w:eastAsia="Times New Roman" w:hAnsi="Garamond" w:cs="Times New Roman"/>
-              </w:rPr>
-            </w:pPr>
-            <w:r>
-              <w:rPr>
-                <w:rFonts w:ascii="Garamond" w:eastAsia="Times New Roman" w:hAnsi="Garamond" w:cs="Times New Roman"/>
-              </w:rPr>
-              <w:t>Reason</w:t>
-            </w:r>
-          </w:p>
-        </w:tc>
-        <w:tc>
-          <w:tcPr>
-            <w:tcW w:w="1920" w:type="dxa"/>
-            <w:tcMar>
-              <w:top w:w="100" w:type="dxa"/>
-              <w:left w:w="100" w:type="dxa"/>
-              <w:bottom w:w="100" w:type="dxa"/>
-              <w:right w:w="100" w:type="dxa"/>
-            </w:tcMar>
-          </w:tcPr>
-          <w:p>
-            <w:pPr>
-              <w:widowControl w:val="0"/>
-              <w:spacing w:line="240" w:lineRule="auto"/>
-              <w:rPr>
-                <w:rFonts w:ascii="Garamond" w:eastAsia="Times New Roman" w:hAnsi="Garamond" w:cs="Times New Roman"/>
-              </w:rPr>
-            </w:pPr>
-            <w:sdt>
-              <w:sdtPr>
-                <w:rPr>
-                  <w:rFonts w:ascii="Garamond" w:hAnsi="Garamond"/>
-                </w:rPr>
-                <w:alias w:val="Reason"/>
-                <w:id w:val="1158964583"/>
-                <w:dropDownList>
-                  <w:listItem w:displayText="Select One" w:value="Select One"/>
-                  <w:listItem w:displayText="Typo/Error" w:value="Typo/Error"/>
-                  <w:listItem w:displayText="Plan not possible" w:value="Plan not possible"/>
-                  <w:listItem w:displayText="New knowledge" w:value="New knowledge"/>
-                  <w:listItem w:displayText="Peer review" w:value="Peer review"/>
-                  <w:listItem w:displayText="Miscommunication" w:value="Miscommunication"/>
-                  <w:listItem w:displayText="Other (Please Explain)" w:value="Other (Please Explain)"/>
-                </w:dropDownList>
-              </w:sdtPr>
-              <w:sdtContent>
-                <w:r>
-                  <w:rPr>
-                    <w:rFonts w:ascii="Garamond" w:eastAsia="Times New Roman" w:hAnsi="Garamond" w:cs="Times New Roman"/>
-                    <w:color w:val="000000"/>
-                    <w:shd w:val="clear" w:color="auto" w:fill="E8EAED"/>
-                  </w:rPr>
-                  <w:t>Select One</w:t>
-                </w:r>
-              </w:sdtContent>
-            </w:sdt>
-          </w:p>
-        </w:tc>
-        <w:tc>
-          <w:tcPr>
-            <w:tcW w:w="4170" w:type="dxa"/>
-            <w:vMerge/>
-          </w:tcPr>
-          <w:p>
-            <w:pPr>
-              <w:widowControl w:val="0"/>
-              <w:spacing w:line="240" w:lineRule="auto"/>
-              <w:rPr>
-                <w:rFonts w:ascii="Garamond" w:eastAsia="Times New Roman" w:hAnsi="Garamond" w:cs="Times New Roman"/>
-              </w:rPr>
-            </w:pPr>
-          </w:p>
-        </w:tc>
-        <w:tc>
-          <w:tcPr>
-            <w:tcW w:w="4050" w:type="dxa"/>
-            <w:vMerge/>
-          </w:tcPr>
-          <w:p>
-            <w:pPr>
-              <w:widowControl w:val="0"/>
-              <w:spacing w:line="240" w:lineRule="auto"/>
-              <w:rPr>
-                <w:rFonts w:ascii="Garamond" w:eastAsia="Times New Roman" w:hAnsi="Garamond" w:cs="Times New Roman"/>
-              </w:rPr>
-            </w:pPr>
-          </w:p>
-        </w:tc>
-        <w:tc>
-          <w:tcPr>
-            <w:tcW w:w="2880" w:type="dxa"/>
-            <w:vMerge/>
-            <w:tcBorders>
-              <w:right w:val="nil"/>
-            </w:tcBorders>
-            <w:tcMar>
-              <w:top w:w="100" w:type="dxa"/>
-              <w:left w:w="100" w:type="dxa"/>
-              <w:bottom w:w="100" w:type="dxa"/>
-              <w:right w:w="100" w:type="dxa"/>
-            </w:tcMar>
-          </w:tcPr>
-          <w:p>
-            <w:pPr>
-              <w:widowControl w:val="0"/>
-              <w:spacing w:line="240" w:lineRule="auto"/>
-              <w:rPr>
-                <w:rFonts w:ascii="Garamond" w:eastAsia="Times New Roman" w:hAnsi="Garamond" w:cs="Times New Roman"/>
-              </w:rPr>
-            </w:pPr>
-          </w:p>
-        </w:tc>
-      </w:tr>
-      <w:tr>
-        <w:trPr>
-          <w:trHeight w:val="20"/>
-        </w:trPr>
-        <w:tc>
-          <w:tcPr>
-            <w:tcW w:w="270" w:type="dxa"/>
-            <w:vMerge/>
-            <w:tcBorders>
-              <w:left w:val="nil"/>
-              <w:bottom w:val="single" w:sz="18" w:space="0" w:color="000000"/>
-            </w:tcBorders>
-            <w:tcMar>
-              <w:top w:w="100" w:type="dxa"/>
-              <w:left w:w="100" w:type="dxa"/>
-              <w:bottom w:w="100" w:type="dxa"/>
-              <w:right w:w="100" w:type="dxa"/>
-            </w:tcMar>
-          </w:tcPr>
-          <w:p>
-            <w:pPr>
-              <w:widowControl w:val="0"/>
-              <w:spacing w:line="240" w:lineRule="auto"/>
-              <w:rPr>
-                <w:rFonts w:ascii="Garamond" w:eastAsia="Times New Roman" w:hAnsi="Garamond" w:cs="Times New Roman"/>
-              </w:rPr>
-            </w:pPr>
-          </w:p>
-        </w:tc>
-        <w:tc>
-          <w:tcPr>
-            <w:tcW w:w="1020" w:type="dxa"/>
-            <w:tcBorders>
-              <w:bottom w:val="single" w:sz="18" w:space="0" w:color="000000"/>
-            </w:tcBorders>
-            <w:tcMar>
-              <w:top w:w="100" w:type="dxa"/>
-              <w:left w:w="100" w:type="dxa"/>
-              <w:bottom w:w="100" w:type="dxa"/>
-              <w:right w:w="100" w:type="dxa"/>
-            </w:tcMar>
-          </w:tcPr>
-          <w:p>
-            <w:pPr>
-              <w:widowControl w:val="0"/>
-              <w:spacing w:line="240" w:lineRule="auto"/>
-              <w:rPr>
-                <w:rFonts w:ascii="Garamond" w:eastAsia="Times New Roman" w:hAnsi="Garamond" w:cs="Times New Roman"/>
-              </w:rPr>
-            </w:pPr>
-            <w:r>
-              <w:rPr>
-                <w:rFonts w:ascii="Garamond" w:eastAsia="Times New Roman" w:hAnsi="Garamond" w:cs="Times New Roman"/>
-              </w:rPr>
-              <w:t>Timing</w:t>
-            </w:r>
-          </w:p>
-        </w:tc>
-        <w:tc>
-          <w:tcPr>
-            <w:tcW w:w="1920" w:type="dxa"/>
-            <w:tcBorders>
-              <w:bottom w:val="single" w:sz="18" w:space="0" w:color="000000"/>
-            </w:tcBorders>
-            <w:tcMar>
-              <w:top w:w="100" w:type="dxa"/>
-              <w:left w:w="100" w:type="dxa"/>
-              <w:bottom w:w="100" w:type="dxa"/>
-              <w:right w:w="100" w:type="dxa"/>
-            </w:tcMar>
-          </w:tcPr>
-          <w:p>
-            <w:pPr>
-              <w:widowControl w:val="0"/>
-              <w:spacing w:line="240" w:lineRule="auto"/>
-              <w:rPr>
-                <w:rFonts w:ascii="Garamond" w:eastAsia="Times New Roman" w:hAnsi="Garamond" w:cs="Times New Roman"/>
-              </w:rPr>
-            </w:pPr>
-            <w:sdt>
-              <w:sdtPr>
-                <w:rPr>
-                  <w:rFonts w:ascii="Garamond" w:hAnsi="Garamond"/>
-                </w:rPr>
-                <w:alias w:val="Timing"/>
-                <w:id w:val="1951044025"/>
-                <w:dropDownList>
-                  <w:listItem w:displayText="Select One" w:value="Select One"/>
-                  <w:listItem w:displayText="Before data collection" w:value="Before data collection"/>
-                  <w:listItem w:displayText="During data collection" w:value="During data collection"/>
-                  <w:listItem w:displayText="Before data access" w:value="Before data access"/>
-                  <w:listItem w:displayText="After data access" w:value="After data access"/>
-                  <w:listItem w:displayText="After results known" w:value="After results known"/>
-                  <w:listItem w:displayText="Other (Please Explain)" w:value="Other (Please Explain)"/>
-                </w:dropDownList>
-              </w:sdtPr>
-              <w:sdtContent>
-                <w:r>
-                  <w:rPr>
-                    <w:rFonts w:ascii="Garamond" w:eastAsia="Times New Roman" w:hAnsi="Garamond" w:cs="Times New Roman"/>
-                  </w:rPr>
-                  <w:t>Select One</w:t>
-                </w:r>
-              </w:sdtContent>
-            </w:sdt>
-          </w:p>
-        </w:tc>
-        <w:tc>
-          <w:tcPr>
-            <w:tcW w:w="4170" w:type="dxa"/>
-            <w:vMerge/>
-            <w:tcBorders>
-              <w:bottom w:val="single" w:sz="18" w:space="0" w:color="000000"/>
-            </w:tcBorders>
-          </w:tcPr>
-          <w:p>
-            <w:pPr>
-              <w:widowControl w:val="0"/>
-              <w:spacing w:line="240" w:lineRule="auto"/>
-              <w:rPr>
-                <w:rFonts w:ascii="Garamond" w:eastAsia="Times New Roman" w:hAnsi="Garamond" w:cs="Times New Roman"/>
-              </w:rPr>
-            </w:pPr>
-          </w:p>
-        </w:tc>
-        <w:tc>
-          <w:tcPr>
-            <w:tcW w:w="4050" w:type="dxa"/>
-            <w:vMerge/>
-            <w:tcBorders>
-              <w:bottom w:val="single" w:sz="18" w:space="0" w:color="000000"/>
-            </w:tcBorders>
-          </w:tcPr>
-          <w:p>
-            <w:pPr>
-              <w:widowControl w:val="0"/>
-              <w:spacing w:line="240" w:lineRule="auto"/>
-              <w:rPr>
-                <w:rFonts w:ascii="Garamond" w:eastAsia="Times New Roman" w:hAnsi="Garamond" w:cs="Times New Roman"/>
-              </w:rPr>
-            </w:pPr>
-          </w:p>
-        </w:tc>
-        <w:tc>
-          <w:tcPr>
-            <w:tcW w:w="2880" w:type="dxa"/>
-            <w:vMerge/>
-            <w:tcBorders>
-              <w:bottom w:val="single" w:sz="18" w:space="0" w:color="000000"/>
-              <w:right w:val="nil"/>
-            </w:tcBorders>
-            <w:tcMar>
-              <w:top w:w="100" w:type="dxa"/>
-              <w:left w:w="100" w:type="dxa"/>
-              <w:bottom w:w="100" w:type="dxa"/>
-              <w:right w:w="100" w:type="dxa"/>
-            </w:tcMar>
-          </w:tcPr>
-          <w:p>
-            <w:pPr>
-              <w:widowControl w:val="0"/>
-              <w:spacing w:line="240" w:lineRule="auto"/>
-              <w:rPr>
-                <w:rFonts w:ascii="Garamond" w:eastAsia="Times New Roman" w:hAnsi="Garamond" w:cs="Times New Roman"/>
-              </w:rPr>
-            </w:pPr>
-          </w:p>
-        </w:tc>
-      </w:tr>
-      <w:tr>
-        <w:trPr>
-          <w:trHeight w:val="20"/>
-        </w:trPr>
-        <w:tc>
-          <w:tcPr>
-            <w:tcW w:w="270" w:type="dxa"/>
-            <w:vMerge w:val="restart"/>
-            <w:tcBorders>
-              <w:left w:val="nil"/>
-            </w:tcBorders>
-            <w:tcMar>
-              <w:top w:w="100" w:type="dxa"/>
-              <w:left w:w="100" w:type="dxa"/>
-              <w:bottom w:w="100" w:type="dxa"/>
-              <w:right w:w="100" w:type="dxa"/>
-            </w:tcMar>
-          </w:tcPr>
-          <w:p>
-            <w:pPr>
-              <w:widowControl w:val="0"/>
-              <w:spacing w:line="240" w:lineRule="auto"/>
-              <w:rPr>
-                <w:rFonts w:ascii="Garamond" w:eastAsia="Times New Roman" w:hAnsi="Garamond" w:cs="Times New Roman"/>
-              </w:rPr>
-            </w:pPr>
-            <w:r>
-              <w:rPr>
-                <w:rFonts w:ascii="Garamond" w:eastAsia="Times New Roman" w:hAnsi="Garamond" w:cs="Times New Roman"/>
-              </w:rPr>
-              <w:t>3</w:t>
-            </w:r>
-          </w:p>
-        </w:tc>
-        <w:tc>
-          <w:tcPr>
-            <w:tcW w:w="1020" w:type="dxa"/>
-            <w:tcMar>
-              <w:top w:w="100" w:type="dxa"/>
-              <w:left w:w="100" w:type="dxa"/>
-              <w:bottom w:w="100" w:type="dxa"/>
-              <w:right w:w="100" w:type="dxa"/>
-            </w:tcMar>
-          </w:tcPr>
-          <w:p>
-            <w:pPr>
-              <w:widowControl w:val="0"/>
-              <w:spacing w:line="240" w:lineRule="auto"/>
-              <w:rPr>
-                <w:rFonts w:ascii="Garamond" w:eastAsia="Times New Roman" w:hAnsi="Garamond" w:cs="Times New Roman"/>
-              </w:rPr>
-            </w:pPr>
-            <w:r>
-              <w:rPr>
-                <w:rFonts w:ascii="Garamond" w:eastAsia="Times New Roman" w:hAnsi="Garamond" w:cs="Times New Roman"/>
-              </w:rPr>
-              <w:t>Type</w:t>
-            </w:r>
-          </w:p>
-        </w:tc>
-        <w:tc>
-          <w:tcPr>
-            <w:tcW w:w="1920" w:type="dxa"/>
-            <w:tcMar>
-              <w:top w:w="100" w:type="dxa"/>
-              <w:left w:w="100" w:type="dxa"/>
-              <w:bottom w:w="100" w:type="dxa"/>
-              <w:right w:w="100" w:type="dxa"/>
-            </w:tcMar>
-          </w:tcPr>
-          <w:p>
-            <w:pPr>
-              <w:widowControl w:val="0"/>
-              <w:spacing w:line="240" w:lineRule="auto"/>
-              <w:rPr>
-                <w:rFonts w:ascii="Garamond" w:eastAsia="Times New Roman" w:hAnsi="Garamond" w:cs="Times New Roman"/>
-              </w:rPr>
-            </w:pPr>
-            <w:sdt>
-              <w:sdtPr>
-                <w:rPr>
-                  <w:rFonts w:ascii="Garamond" w:hAnsi="Garamond"/>
-                </w:rPr>
-                <w:alias w:val="Type"/>
-                <w:id w:val="-228306292"/>
-                <w:dropDownList>
-                  <w:listItem w:displayText="Select One" w:value="Select One"/>
-                  <w:listItem w:displayText="Study Design" w:value="Study Design"/>
-                  <w:listItem w:displayText="Sample" w:value="Sample"/>
-                  <w:listItem w:displayText="Research Q(s)" w:value="Research Q(s)"/>
-                  <w:listItem w:displayText="Hypotheses" w:value="Hypotheses"/>
-                  <w:listItem w:displayText="Variables" w:value="Variables"/>
-                  <w:listItem w:displayText="Analysis" w:value="Analysis"/>
-                  <w:listItem w:displayText="Covariates" w:value="Covariates"/>
-                  <w:listItem w:displayText="Inferential Criteria" w:value="Inferential Criteria"/>
-                  <w:listItem w:displayText="Data Preparation" w:value="Data Preparation"/>
-                  <w:listItem w:displayText="Other (Please Explain)" w:value="Other (Please Explain)"/>
-                </w:dropDownList>
-              </w:sdtPr>
-              <w:sdtContent>
-                <w:r>
-                  <w:rPr>
-                    <w:rFonts w:ascii="Garamond" w:eastAsia="Times New Roman" w:hAnsi="Garamond" w:cs="Times New Roman"/>
-                  </w:rPr>
-                  <w:t>Select One</w:t>
-                </w:r>
-              </w:sdtContent>
-            </w:sdt>
-          </w:p>
-        </w:tc>
-        <w:tc>
-          <w:tcPr>
-            <w:tcW w:w="4170" w:type="dxa"/>
-            <w:vMerge w:val="restart"/>
-          </w:tcPr>
-          <w:p>
-            <w:pPr>
-              <w:widowControl w:val="0"/>
-              <w:spacing w:line="240" w:lineRule="auto"/>
-              <w:rPr>
-                <w:rFonts w:ascii="Garamond" w:eastAsia="Times New Roman" w:hAnsi="Garamond" w:cs="Times New Roman"/>
-              </w:rPr>
-            </w:pPr>
-          </w:p>
-        </w:tc>
-        <w:tc>
-          <w:tcPr>
-            <w:tcW w:w="4050" w:type="dxa"/>
-            <w:vMerge w:val="restart"/>
-          </w:tcPr>
-          <w:p>
-            <w:pPr>
-              <w:widowControl w:val="0"/>
-              <w:spacing w:line="240" w:lineRule="auto"/>
-              <w:rPr>
-                <w:rFonts w:ascii="Garamond" w:eastAsia="Times New Roman" w:hAnsi="Garamond" w:cs="Times New Roman"/>
-              </w:rPr>
-            </w:pPr>
-          </w:p>
-        </w:tc>
-        <w:tc>
-          <w:tcPr>
-            <w:tcW w:w="2880" w:type="dxa"/>
-            <w:vMerge w:val="restart"/>
-            <w:tcBorders>
-              <w:right w:val="nil"/>
-            </w:tcBorders>
-            <w:tcMar>
-              <w:top w:w="100" w:type="dxa"/>
-              <w:left w:w="100" w:type="dxa"/>
-              <w:bottom w:w="100" w:type="dxa"/>
-              <w:right w:w="100" w:type="dxa"/>
-            </w:tcMar>
-          </w:tcPr>
-          <w:p>
-            <w:pPr>
-              <w:widowControl w:val="0"/>
-              <w:spacing w:line="240" w:lineRule="auto"/>
-              <w:rPr>
-                <w:rFonts w:ascii="Garamond" w:eastAsia="Times New Roman" w:hAnsi="Garamond" w:cs="Times New Roman"/>
-              </w:rPr>
-            </w:pPr>
-          </w:p>
-        </w:tc>
-      </w:tr>
-      <w:tr>
-        <w:trPr>
-          <w:trHeight w:val="20"/>
-        </w:trPr>
-        <w:tc>
-          <w:tcPr>
-            <w:tcW w:w="270" w:type="dxa"/>
-            <w:vMerge/>
-            <w:tcBorders>
-              <w:left w:val="nil"/>
-            </w:tcBorders>
-            <w:tcMar>
-              <w:top w:w="100" w:type="dxa"/>
-              <w:left w:w="100" w:type="dxa"/>
-              <w:bottom w:w="100" w:type="dxa"/>
-              <w:right w:w="100" w:type="dxa"/>
-            </w:tcMar>
-          </w:tcPr>
-          <w:p>
-            <w:pPr>
-              <w:widowControl w:val="0"/>
-              <w:spacing w:line="240" w:lineRule="auto"/>
-              <w:rPr>
-                <w:rFonts w:ascii="Garamond" w:eastAsia="Times New Roman" w:hAnsi="Garamond" w:cs="Times New Roman"/>
-              </w:rPr>
-            </w:pPr>
-          </w:p>
-        </w:tc>
-        <w:tc>
-          <w:tcPr>
-            <w:tcW w:w="1020" w:type="dxa"/>
-            <w:tcMar>
-              <w:top w:w="100" w:type="dxa"/>
-              <w:left w:w="100" w:type="dxa"/>
-              <w:bottom w:w="100" w:type="dxa"/>
-              <w:right w:w="100" w:type="dxa"/>
-            </w:tcMar>
-          </w:tcPr>
-          <w:p>
-            <w:pPr>
-              <w:widowControl w:val="0"/>
-              <w:spacing w:line="240" w:lineRule="auto"/>
-              <w:rPr>
-                <w:rFonts w:ascii="Garamond" w:eastAsia="Times New Roman" w:hAnsi="Garamond" w:cs="Times New Roman"/>
-              </w:rPr>
-            </w:pPr>
-            <w:r>
-              <w:rPr>
-                <w:rFonts w:ascii="Garamond" w:eastAsia="Times New Roman" w:hAnsi="Garamond" w:cs="Times New Roman"/>
-              </w:rPr>
-              <w:t>Reason</w:t>
-            </w:r>
-          </w:p>
-        </w:tc>
-        <w:tc>
-          <w:tcPr>
-            <w:tcW w:w="1920" w:type="dxa"/>
-            <w:tcMar>
-              <w:top w:w="100" w:type="dxa"/>
-              <w:left w:w="100" w:type="dxa"/>
-              <w:bottom w:w="100" w:type="dxa"/>
-              <w:right w:w="100" w:type="dxa"/>
-            </w:tcMar>
-          </w:tcPr>
-          <w:p>
-            <w:pPr>
-              <w:widowControl w:val="0"/>
-              <w:spacing w:line="240" w:lineRule="auto"/>
-              <w:rPr>
-                <w:rFonts w:ascii="Garamond" w:eastAsia="Times New Roman" w:hAnsi="Garamond" w:cs="Times New Roman"/>
-              </w:rPr>
-            </w:pPr>
-            <w:sdt>
-              <w:sdtPr>
-                <w:rPr>
-                  <w:rFonts w:ascii="Garamond" w:hAnsi="Garamond"/>
-                </w:rPr>
-                <w:alias w:val="Reason"/>
-                <w:id w:val="325404416"/>
-                <w:dropDownList>
-                  <w:listItem w:displayText="Select One" w:value="Select One"/>
-                  <w:listItem w:displayText="Typo/Error" w:value="Typo/Error"/>
-                  <w:listItem w:displayText="Plan not possible" w:value="Plan not possible"/>
-                  <w:listItem w:displayText="New knowledge" w:value="New knowledge"/>
-                  <w:listItem w:displayText="Peer review" w:value="Peer review"/>
-                  <w:listItem w:displayText="Miscommunication" w:value="Miscommunication"/>
-                  <w:listItem w:displayText="Other (Please Explain)" w:value="Other (Please Explain)"/>
-                </w:dropDownList>
-              </w:sdtPr>
-              <w:sdtContent>
-                <w:r>
-                  <w:rPr>
-                    <w:rFonts w:ascii="Garamond" w:eastAsia="Times New Roman" w:hAnsi="Garamond" w:cs="Times New Roman"/>
-                    <w:color w:val="000000"/>
-                    <w:shd w:val="clear" w:color="auto" w:fill="E8EAED"/>
-                  </w:rPr>
-                  <w:t>Select One</w:t>
-                </w:r>
-              </w:sdtContent>
-            </w:sdt>
-          </w:p>
-        </w:tc>
-        <w:tc>
-          <w:tcPr>
-            <w:tcW w:w="4170" w:type="dxa"/>
-            <w:vMerge/>
-          </w:tcPr>
-          <w:p>
-            <w:pPr>
-              <w:widowControl w:val="0"/>
-              <w:spacing w:line="240" w:lineRule="auto"/>
-              <w:rPr>
-                <w:rFonts w:ascii="Garamond" w:eastAsia="Times New Roman" w:hAnsi="Garamond" w:cs="Times New Roman"/>
-              </w:rPr>
-            </w:pPr>
-          </w:p>
-        </w:tc>
-        <w:tc>
-          <w:tcPr>
-            <w:tcW w:w="4050" w:type="dxa"/>
-            <w:vMerge/>
-          </w:tcPr>
-          <w:p>
-            <w:pPr>
-              <w:widowControl w:val="0"/>
-              <w:spacing w:line="240" w:lineRule="auto"/>
-              <w:rPr>
-                <w:rFonts w:ascii="Garamond" w:eastAsia="Times New Roman" w:hAnsi="Garamond" w:cs="Times New Roman"/>
-              </w:rPr>
-            </w:pPr>
-          </w:p>
-        </w:tc>
-        <w:tc>
-          <w:tcPr>
-            <w:tcW w:w="2880" w:type="dxa"/>
-            <w:vMerge/>
-            <w:tcBorders>
-              <w:right w:val="nil"/>
-            </w:tcBorders>
-            <w:tcMar>
-              <w:top w:w="100" w:type="dxa"/>
-              <w:left w:w="100" w:type="dxa"/>
-              <w:bottom w:w="100" w:type="dxa"/>
-              <w:right w:w="100" w:type="dxa"/>
-            </w:tcMar>
-          </w:tcPr>
-          <w:p>
-            <w:pPr>
-              <w:widowControl w:val="0"/>
-              <w:spacing w:line="240" w:lineRule="auto"/>
-              <w:rPr>
-                <w:rFonts w:ascii="Garamond" w:eastAsia="Times New Roman" w:hAnsi="Garamond" w:cs="Times New Roman"/>
-              </w:rPr>
-            </w:pPr>
-          </w:p>
-        </w:tc>
-      </w:tr>
-      <w:tr>
-        <w:trPr>
-          <w:trHeight w:val="20"/>
-        </w:trPr>
-        <w:tc>
-          <w:tcPr>
-            <w:tcW w:w="270" w:type="dxa"/>
-            <w:vMerge/>
-            <w:tcBorders>
-              <w:left w:val="nil"/>
-              <w:bottom w:val="single" w:sz="18" w:space="0" w:color="000000"/>
-            </w:tcBorders>
-            <w:tcMar>
-              <w:top w:w="100" w:type="dxa"/>
-              <w:left w:w="100" w:type="dxa"/>
-              <w:bottom w:w="100" w:type="dxa"/>
-              <w:right w:w="100" w:type="dxa"/>
-            </w:tcMar>
-          </w:tcPr>
-          <w:p>
-            <w:pPr>
-              <w:widowControl w:val="0"/>
-              <w:spacing w:line="240" w:lineRule="auto"/>
-              <w:rPr>
-                <w:rFonts w:ascii="Garamond" w:eastAsia="Times New Roman" w:hAnsi="Garamond" w:cs="Times New Roman"/>
-              </w:rPr>
-            </w:pPr>
-          </w:p>
-        </w:tc>
-        <w:tc>
-          <w:tcPr>
-            <w:tcW w:w="1020" w:type="dxa"/>
-            <w:tcBorders>
-              <w:bottom w:val="single" w:sz="18" w:space="0" w:color="000000"/>
-            </w:tcBorders>
-            <w:tcMar>
-              <w:top w:w="100" w:type="dxa"/>
-              <w:left w:w="100" w:type="dxa"/>
-              <w:bottom w:w="100" w:type="dxa"/>
-              <w:right w:w="100" w:type="dxa"/>
-            </w:tcMar>
-          </w:tcPr>
-          <w:p>
-            <w:pPr>
-              <w:widowControl w:val="0"/>
-              <w:spacing w:line="240" w:lineRule="auto"/>
-              <w:rPr>
-                <w:rFonts w:ascii="Garamond" w:eastAsia="Times New Roman" w:hAnsi="Garamond" w:cs="Times New Roman"/>
-              </w:rPr>
-            </w:pPr>
-            <w:r>
-              <w:rPr>
-                <w:rFonts w:ascii="Garamond" w:eastAsia="Times New Roman" w:hAnsi="Garamond" w:cs="Times New Roman"/>
-              </w:rPr>
-              <w:t>Timing</w:t>
-            </w:r>
-          </w:p>
-        </w:tc>
-        <w:tc>
-          <w:tcPr>
-            <w:tcW w:w="1920" w:type="dxa"/>
-            <w:tcBorders>
-              <w:bottom w:val="single" w:sz="18" w:space="0" w:color="000000"/>
-            </w:tcBorders>
-            <w:tcMar>
-              <w:top w:w="100" w:type="dxa"/>
-              <w:left w:w="100" w:type="dxa"/>
-              <w:bottom w:w="100" w:type="dxa"/>
-              <w:right w:w="100" w:type="dxa"/>
-            </w:tcMar>
-          </w:tcPr>
-          <w:p>
-            <w:pPr>
-              <w:widowControl w:val="0"/>
-              <w:spacing w:line="240" w:lineRule="auto"/>
-              <w:rPr>
-                <w:rFonts w:ascii="Garamond" w:eastAsia="Times New Roman" w:hAnsi="Garamond" w:cs="Times New Roman"/>
-              </w:rPr>
-            </w:pPr>
-            <w:sdt>
-              <w:sdtPr>
-                <w:rPr>
-                  <w:rFonts w:ascii="Garamond" w:hAnsi="Garamond"/>
-                </w:rPr>
-                <w:alias w:val="Timing"/>
-                <w:id w:val="533848905"/>
-                <w:dropDownList>
-                  <w:listItem w:displayText="Select One" w:value="Select One"/>
-                  <w:listItem w:displayText="Before data collection" w:value="Before data collection"/>
-                  <w:listItem w:displayText="During data collection" w:value="During data collection"/>
-                  <w:listItem w:displayText="Before data access" w:value="Before data access"/>
-                  <w:listItem w:displayText="After data access" w:value="After data access"/>
-                  <w:listItem w:displayText="After results known" w:value="After results known"/>
-                  <w:listItem w:displayText="Other (Please Explain)" w:value="Other (Please Explain)"/>
-                </w:dropDownList>
-              </w:sdtPr>
-              <w:sdtContent>
-                <w:r>
-                  <w:rPr>
-                    <w:rFonts w:ascii="Garamond" w:eastAsia="Times New Roman" w:hAnsi="Garamond" w:cs="Times New Roman"/>
-                  </w:rPr>
-                  <w:t>Select One</w:t>
-                </w:r>
-              </w:sdtContent>
-            </w:sdt>
-          </w:p>
-        </w:tc>
-        <w:tc>
-          <w:tcPr>
-            <w:tcW w:w="4170" w:type="dxa"/>
-            <w:vMerge/>
-            <w:tcBorders>
-              <w:bottom w:val="single" w:sz="18" w:space="0" w:color="000000"/>
-            </w:tcBorders>
-          </w:tcPr>
-          <w:p>
-            <w:pPr>
-              <w:widowControl w:val="0"/>
-              <w:spacing w:line="240" w:lineRule="auto"/>
-              <w:rPr>
-                <w:rFonts w:ascii="Garamond" w:eastAsia="Times New Roman" w:hAnsi="Garamond" w:cs="Times New Roman"/>
-              </w:rPr>
-            </w:pPr>
-          </w:p>
-        </w:tc>
-        <w:tc>
-          <w:tcPr>
-            <w:tcW w:w="4050" w:type="dxa"/>
-            <w:vMerge/>
-            <w:tcBorders>
-              <w:bottom w:val="single" w:sz="18" w:space="0" w:color="000000"/>
-            </w:tcBorders>
-          </w:tcPr>
-          <w:p>
-            <w:pPr>
-              <w:widowControl w:val="0"/>
-              <w:spacing w:line="240" w:lineRule="auto"/>
-              <w:rPr>
-                <w:rFonts w:ascii="Garamond" w:eastAsia="Times New Roman" w:hAnsi="Garamond" w:cs="Times New Roman"/>
-              </w:rPr>
-            </w:pPr>
-          </w:p>
-        </w:tc>
-        <w:tc>
-          <w:tcPr>
-            <w:tcW w:w="2880" w:type="dxa"/>
-            <w:vMerge/>
-            <w:tcBorders>
-              <w:bottom w:val="single" w:sz="18" w:space="0" w:color="000000"/>
-              <w:right w:val="nil"/>
-            </w:tcBorders>
-            <w:tcMar>
-              <w:top w:w="100" w:type="dxa"/>
-              <w:left w:w="100" w:type="dxa"/>
-              <w:bottom w:w="100" w:type="dxa"/>
-              <w:right w:w="100" w:type="dxa"/>
-            </w:tcMar>
-          </w:tcPr>
-          <w:p>
-            <w:pPr>
-              <w:widowControl w:val="0"/>
-              <w:spacing w:line="240" w:lineRule="auto"/>
-              <w:rPr>
-                <w:rFonts w:ascii="Garamond" w:eastAsia="Times New Roman" w:hAnsi="Garamond" w:cs="Times New Roman"/>
-              </w:rPr>
-            </w:pPr>
-          </w:p>
-        </w:tc>
-      </w:tr>
-      <w:tr>
-        <w:trPr>
-          <w:trHeight w:val="20"/>
-        </w:trPr>
-        <w:tc>
-          <w:tcPr>
-            <w:tcW w:w="270" w:type="dxa"/>
-            <w:vMerge w:val="restart"/>
-            <w:tcBorders>
-              <w:left w:val="nil"/>
-            </w:tcBorders>
-            <w:tcMar>
-              <w:top w:w="100" w:type="dxa"/>
-              <w:left w:w="100" w:type="dxa"/>
-              <w:bottom w:w="100" w:type="dxa"/>
-              <w:right w:w="100" w:type="dxa"/>
-            </w:tcMar>
-          </w:tcPr>
-          <w:p>
-            <w:pPr>
-              <w:widowControl w:val="0"/>
-              <w:spacing w:line="240" w:lineRule="auto"/>
-              <w:rPr>
-                <w:rFonts w:ascii="Garamond" w:eastAsia="Times New Roman" w:hAnsi="Garamond" w:cs="Times New Roman"/>
-              </w:rPr>
-            </w:pPr>
-            <w:r>
-              <w:rPr>
-                <w:rFonts w:ascii="Garamond" w:eastAsia="Times New Roman" w:hAnsi="Garamond" w:cs="Times New Roman"/>
-              </w:rPr>
-              <w:t>3</w:t>
-            </w:r>
-          </w:p>
-        </w:tc>
-        <w:tc>
-          <w:tcPr>
-            <w:tcW w:w="1020" w:type="dxa"/>
-            <w:tcMar>
-              <w:top w:w="100" w:type="dxa"/>
-              <w:left w:w="100" w:type="dxa"/>
-              <w:bottom w:w="100" w:type="dxa"/>
-              <w:right w:w="100" w:type="dxa"/>
-            </w:tcMar>
-          </w:tcPr>
-          <w:p>
-            <w:pPr>
-              <w:widowControl w:val="0"/>
-              <w:spacing w:line="240" w:lineRule="auto"/>
-              <w:rPr>
-                <w:rFonts w:ascii="Garamond" w:eastAsia="Times New Roman" w:hAnsi="Garamond" w:cs="Times New Roman"/>
-              </w:rPr>
-            </w:pPr>
-            <w:r>
-              <w:rPr>
-                <w:rFonts w:ascii="Garamond" w:eastAsia="Times New Roman" w:hAnsi="Garamond" w:cs="Times New Roman"/>
-              </w:rPr>
-              <w:t>Type</w:t>
-            </w:r>
-          </w:p>
-        </w:tc>
-        <w:tc>
-          <w:tcPr>
-            <w:tcW w:w="1920" w:type="dxa"/>
-            <w:tcMar>
-              <w:top w:w="100" w:type="dxa"/>
-              <w:left w:w="100" w:type="dxa"/>
-              <w:bottom w:w="100" w:type="dxa"/>
-              <w:right w:w="100" w:type="dxa"/>
-            </w:tcMar>
-          </w:tcPr>
-          <w:p>
-            <w:pPr>
-              <w:widowControl w:val="0"/>
-              <w:spacing w:line="240" w:lineRule="auto"/>
-              <w:rPr>
-                <w:rFonts w:ascii="Garamond" w:eastAsia="Times New Roman" w:hAnsi="Garamond" w:cs="Times New Roman"/>
-              </w:rPr>
-            </w:pPr>
-            <w:sdt>
-              <w:sdtPr>
-                <w:rPr>
-                  <w:rFonts w:ascii="Garamond" w:hAnsi="Garamond"/>
-                </w:rPr>
-                <w:alias w:val="Type"/>
-                <w:id w:val="1422068573"/>
-                <w:dropDownList>
-                  <w:listItem w:displayText="Select One" w:value="Select One"/>
-                  <w:listItem w:displayText="Study Design" w:value="Study Design"/>
-                  <w:listItem w:displayText="Sample" w:value="Sample"/>
-                  <w:listItem w:displayText="Research Q(s)" w:value="Research Q(s)"/>
-                  <w:listItem w:displayText="Hypotheses" w:value="Hypotheses"/>
-                  <w:listItem w:displayText="Variables" w:value="Variables"/>
-                  <w:listItem w:displayText="Analysis" w:value="Analysis"/>
-                  <w:listItem w:displayText="Covariates" w:value="Covariates"/>
-                  <w:listItem w:displayText="Inferential Criteria" w:value="Inferential Criteria"/>
-                  <w:listItem w:displayText="Data Preparation" w:value="Data Preparation"/>
-                  <w:listItem w:displayText="Other (Please Explain)" w:value="Other (Please Explain)"/>
-                </w:dropDownList>
-              </w:sdtPr>
-              <w:sdtContent>
-                <w:r>
-                  <w:rPr>
-                    <w:rFonts w:ascii="Garamond" w:eastAsia="Times New Roman" w:hAnsi="Garamond" w:cs="Times New Roman"/>
-                  </w:rPr>
-                  <w:t>Select One</w:t>
-                </w:r>
-              </w:sdtContent>
-            </w:sdt>
-          </w:p>
-        </w:tc>
-        <w:tc>
-          <w:tcPr>
-            <w:tcW w:w="4170" w:type="dxa"/>
-            <w:vMerge w:val="restart"/>
-          </w:tcPr>
-          <w:p>
-            <w:pPr>
-              <w:widowControl w:val="0"/>
-              <w:spacing w:line="240" w:lineRule="auto"/>
-              <w:rPr>
-                <w:rFonts w:ascii="Garamond" w:eastAsia="Times New Roman" w:hAnsi="Garamond" w:cs="Times New Roman"/>
-              </w:rPr>
-            </w:pPr>
-          </w:p>
-        </w:tc>
-        <w:tc>
-          <w:tcPr>
-            <w:tcW w:w="4050" w:type="dxa"/>
-            <w:vMerge w:val="restart"/>
-          </w:tcPr>
-          <w:p>
-            <w:pPr>
-              <w:widowControl w:val="0"/>
-              <w:spacing w:line="240" w:lineRule="auto"/>
-              <w:rPr>
-                <w:rFonts w:ascii="Garamond" w:eastAsia="Times New Roman" w:hAnsi="Garamond" w:cs="Times New Roman"/>
-              </w:rPr>
-            </w:pPr>
-          </w:p>
-        </w:tc>
-        <w:tc>
-          <w:tcPr>
-            <w:tcW w:w="2880" w:type="dxa"/>
-            <w:vMerge w:val="restart"/>
-            <w:tcBorders>
-              <w:right w:val="nil"/>
-            </w:tcBorders>
-            <w:tcMar>
-              <w:top w:w="100" w:type="dxa"/>
-              <w:left w:w="100" w:type="dxa"/>
-              <w:bottom w:w="100" w:type="dxa"/>
-              <w:right w:w="100" w:type="dxa"/>
-            </w:tcMar>
-          </w:tcPr>
-          <w:p>
-            <w:pPr>
-              <w:widowControl w:val="0"/>
-              <w:spacing w:line="240" w:lineRule="auto"/>
-              <w:rPr>
-                <w:rFonts w:ascii="Garamond" w:eastAsia="Times New Roman" w:hAnsi="Garamond" w:cs="Times New Roman"/>
-              </w:rPr>
-            </w:pPr>
-          </w:p>
-        </w:tc>
-      </w:tr>
-      <w:tr>
-        <w:trPr>
-          <w:trHeight w:val="20"/>
-        </w:trPr>
-        <w:tc>
-          <w:tcPr>
-            <w:tcW w:w="270" w:type="dxa"/>
-            <w:vMerge/>
-            <w:tcBorders>
-              <w:left w:val="nil"/>
-            </w:tcBorders>
-            <w:tcMar>
-              <w:top w:w="100" w:type="dxa"/>
-              <w:left w:w="100" w:type="dxa"/>
-              <w:bottom w:w="100" w:type="dxa"/>
-              <w:right w:w="100" w:type="dxa"/>
-            </w:tcMar>
-          </w:tcPr>
-          <w:p>
-            <w:pPr>
-              <w:widowControl w:val="0"/>
-              <w:spacing w:line="240" w:lineRule="auto"/>
-              <w:rPr>
-                <w:rFonts w:ascii="Garamond" w:eastAsia="Times New Roman" w:hAnsi="Garamond" w:cs="Times New Roman"/>
-              </w:rPr>
-            </w:pPr>
-          </w:p>
-        </w:tc>
-        <w:tc>
-          <w:tcPr>
-            <w:tcW w:w="1020" w:type="dxa"/>
-            <w:tcMar>
-              <w:top w:w="100" w:type="dxa"/>
-              <w:left w:w="100" w:type="dxa"/>
-              <w:bottom w:w="100" w:type="dxa"/>
-              <w:right w:w="100" w:type="dxa"/>
-            </w:tcMar>
-          </w:tcPr>
-          <w:p>
-            <w:pPr>
-              <w:widowControl w:val="0"/>
-              <w:spacing w:line="240" w:lineRule="auto"/>
-              <w:rPr>
-                <w:rFonts w:ascii="Garamond" w:eastAsia="Times New Roman" w:hAnsi="Garamond" w:cs="Times New Roman"/>
-              </w:rPr>
-            </w:pPr>
-            <w:r>
-              <w:rPr>
-                <w:rFonts w:ascii="Garamond" w:eastAsia="Times New Roman" w:hAnsi="Garamond" w:cs="Times New Roman"/>
-              </w:rPr>
-              <w:t>Reason</w:t>
-            </w:r>
-          </w:p>
-        </w:tc>
-        <w:tc>
-          <w:tcPr>
-            <w:tcW w:w="1920" w:type="dxa"/>
-            <w:tcMar>
-              <w:top w:w="100" w:type="dxa"/>
-              <w:left w:w="100" w:type="dxa"/>
-              <w:bottom w:w="100" w:type="dxa"/>
-              <w:right w:w="100" w:type="dxa"/>
-            </w:tcMar>
-          </w:tcPr>
-          <w:p>
-            <w:pPr>
-              <w:widowControl w:val="0"/>
-              <w:spacing w:line="240" w:lineRule="auto"/>
-              <w:rPr>
-                <w:rFonts w:ascii="Garamond" w:eastAsia="Times New Roman" w:hAnsi="Garamond" w:cs="Times New Roman"/>
-              </w:rPr>
-            </w:pPr>
-            <w:sdt>
-              <w:sdtPr>
-                <w:rPr>
-                  <w:rFonts w:ascii="Garamond" w:hAnsi="Garamond"/>
-                </w:rPr>
-                <w:alias w:val="Reason"/>
-                <w:id w:val="982427100"/>
-                <w:dropDownList>
-                  <w:listItem w:displayText="Select One" w:value="Select One"/>
-                  <w:listItem w:displayText="Typo/Error" w:value="Typo/Error"/>
-                  <w:listItem w:displayText="Plan not possible" w:value="Plan not possible"/>
-                  <w:listItem w:displayText="New knowledge" w:value="New knowledge"/>
-                  <w:listItem w:displayText="Peer review" w:value="Peer review"/>
-                  <w:listItem w:displayText="Miscommunication" w:value="Miscommunication"/>
-                  <w:listItem w:displayText="Other (Please Explain)" w:value="Other (Please Explain)"/>
-                </w:dropDownList>
-              </w:sdtPr>
-              <w:sdtContent>
-                <w:r>
-                  <w:rPr>
-                    <w:rFonts w:ascii="Garamond" w:eastAsia="Times New Roman" w:hAnsi="Garamond" w:cs="Times New Roman"/>
-                    <w:color w:val="000000"/>
-                    <w:shd w:val="clear" w:color="auto" w:fill="E8EAED"/>
-                  </w:rPr>
-                  <w:t>Select One</w:t>
-                </w:r>
-              </w:sdtContent>
-            </w:sdt>
-          </w:p>
-        </w:tc>
-        <w:tc>
-          <w:tcPr>
-            <w:tcW w:w="4170" w:type="dxa"/>
-            <w:vMerge/>
-          </w:tcPr>
-          <w:p>
-            <w:pPr>
-              <w:widowControl w:val="0"/>
-              <w:spacing w:line="240" w:lineRule="auto"/>
-              <w:rPr>
-                <w:rFonts w:ascii="Garamond" w:eastAsia="Times New Roman" w:hAnsi="Garamond" w:cs="Times New Roman"/>
-              </w:rPr>
-            </w:pPr>
-          </w:p>
-        </w:tc>
-        <w:tc>
-          <w:tcPr>
-            <w:tcW w:w="4050" w:type="dxa"/>
-            <w:vMerge/>
-          </w:tcPr>
-          <w:p>
-            <w:pPr>
-              <w:widowControl w:val="0"/>
-              <w:spacing w:line="240" w:lineRule="auto"/>
-              <w:rPr>
-                <w:rFonts w:ascii="Garamond" w:eastAsia="Times New Roman" w:hAnsi="Garamond" w:cs="Times New Roman"/>
-              </w:rPr>
-            </w:pPr>
-          </w:p>
-        </w:tc>
-        <w:tc>
-          <w:tcPr>
-            <w:tcW w:w="2880" w:type="dxa"/>
-            <w:vMerge/>
-            <w:tcBorders>
-              <w:right w:val="nil"/>
-            </w:tcBorders>
-            <w:tcMar>
-              <w:top w:w="100" w:type="dxa"/>
-              <w:left w:w="100" w:type="dxa"/>
-              <w:bottom w:w="100" w:type="dxa"/>
-              <w:right w:w="100" w:type="dxa"/>
-            </w:tcMar>
-          </w:tcPr>
-          <w:p>
-            <w:pPr>
-              <w:widowControl w:val="0"/>
-              <w:spacing w:line="240" w:lineRule="auto"/>
-              <w:rPr>
-                <w:rFonts w:ascii="Garamond" w:eastAsia="Times New Roman" w:hAnsi="Garamond" w:cs="Times New Roman"/>
-              </w:rPr>
-            </w:pPr>
-          </w:p>
-        </w:tc>
-      </w:tr>
-      <w:tr>
-        <w:trPr>
-          <w:trHeight w:val="20"/>
-        </w:trPr>
-        <w:tc>
-          <w:tcPr>
-            <w:tcW w:w="270" w:type="dxa"/>
-            <w:vMerge/>
-            <w:tcBorders>
-              <w:left w:val="nil"/>
-              <w:bottom w:val="single" w:sz="18" w:space="0" w:color="000000"/>
-            </w:tcBorders>
-            <w:tcMar>
-              <w:top w:w="100" w:type="dxa"/>
-              <w:left w:w="100" w:type="dxa"/>
-              <w:bottom w:w="100" w:type="dxa"/>
-              <w:right w:w="100" w:type="dxa"/>
-            </w:tcMar>
-          </w:tcPr>
-          <w:p>
-            <w:pPr>
-              <w:widowControl w:val="0"/>
-              <w:spacing w:line="240" w:lineRule="auto"/>
-              <w:rPr>
-                <w:rFonts w:ascii="Garamond" w:eastAsia="Times New Roman" w:hAnsi="Garamond" w:cs="Times New Roman"/>
-              </w:rPr>
-            </w:pPr>
-          </w:p>
-        </w:tc>
-        <w:tc>
-          <w:tcPr>
-            <w:tcW w:w="1020" w:type="dxa"/>
-            <w:tcBorders>
-              <w:bottom w:val="single" w:sz="18" w:space="0" w:color="000000"/>
-            </w:tcBorders>
-            <w:tcMar>
-              <w:top w:w="100" w:type="dxa"/>
-              <w:left w:w="100" w:type="dxa"/>
-              <w:bottom w:w="100" w:type="dxa"/>
-              <w:right w:w="100" w:type="dxa"/>
-            </w:tcMar>
-          </w:tcPr>
-          <w:p>
-            <w:pPr>
-              <w:widowControl w:val="0"/>
-              <w:spacing w:line="240" w:lineRule="auto"/>
-              <w:rPr>
-                <w:rFonts w:ascii="Garamond" w:eastAsia="Times New Roman" w:hAnsi="Garamond" w:cs="Times New Roman"/>
-              </w:rPr>
-            </w:pPr>
-            <w:r>
-              <w:rPr>
-                <w:rFonts w:ascii="Garamond" w:eastAsia="Times New Roman" w:hAnsi="Garamond" w:cs="Times New Roman"/>
-              </w:rPr>
-              <w:t>Timing</w:t>
-            </w:r>
-          </w:p>
-        </w:tc>
-        <w:tc>
-          <w:tcPr>
-            <w:tcW w:w="1920" w:type="dxa"/>
-            <w:tcBorders>
-              <w:bottom w:val="single" w:sz="18" w:space="0" w:color="000000"/>
-            </w:tcBorders>
-            <w:tcMar>
-              <w:top w:w="100" w:type="dxa"/>
-              <w:left w:w="100" w:type="dxa"/>
-              <w:bottom w:w="100" w:type="dxa"/>
-              <w:right w:w="100" w:type="dxa"/>
-            </w:tcMar>
-          </w:tcPr>
-          <w:p>
-            <w:pPr>
-              <w:widowControl w:val="0"/>
-              <w:spacing w:line="240" w:lineRule="auto"/>
-              <w:rPr>
-                <w:rFonts w:ascii="Garamond" w:eastAsia="Times New Roman" w:hAnsi="Garamond" w:cs="Times New Roman"/>
-              </w:rPr>
-            </w:pPr>
-            <w:sdt>
-              <w:sdtPr>
-                <w:rPr>
-                  <w:rFonts w:ascii="Garamond" w:hAnsi="Garamond"/>
-                </w:rPr>
-                <w:alias w:val="Timing"/>
-                <w:id w:val="1570844493"/>
-                <w:dropDownList>
-                  <w:listItem w:displayText="Select One" w:value="Select One"/>
-                  <w:listItem w:displayText="Before data collection" w:value="Before data collection"/>
-                  <w:listItem w:displayText="During data collection" w:value="During data collection"/>
-                  <w:listItem w:displayText="Before data access" w:value="Before data access"/>
-                  <w:listItem w:displayText="After data access" w:value="After data access"/>
-                  <w:listItem w:displayText="After results known" w:value="After results known"/>
-                  <w:listItem w:displayText="Other (Please Explain)" w:value="Other (Please Explain)"/>
-                </w:dropDownList>
-              </w:sdtPr>
-              <w:sdtContent>
-                <w:r>
-                  <w:rPr>
-                    <w:rFonts w:ascii="Garamond" w:eastAsia="Times New Roman" w:hAnsi="Garamond" w:cs="Times New Roman"/>
-                  </w:rPr>
-                  <w:t>Select One</w:t>
-                </w:r>
-              </w:sdtContent>
-            </w:sdt>
-          </w:p>
-        </w:tc>
-        <w:tc>
-          <w:tcPr>
-            <w:tcW w:w="4170" w:type="dxa"/>
-            <w:vMerge/>
-            <w:tcBorders>
-              <w:bottom w:val="single" w:sz="18" w:space="0" w:color="000000"/>
-            </w:tcBorders>
-          </w:tcPr>
-          <w:p>
-            <w:pPr>
-              <w:widowControl w:val="0"/>
-              <w:spacing w:line="240" w:lineRule="auto"/>
-              <w:rPr>
-                <w:rFonts w:ascii="Garamond" w:eastAsia="Times New Roman" w:hAnsi="Garamond" w:cs="Times New Roman"/>
-              </w:rPr>
-            </w:pPr>
-          </w:p>
-        </w:tc>
-        <w:tc>
-          <w:tcPr>
-            <w:tcW w:w="4050" w:type="dxa"/>
-            <w:vMerge/>
-            <w:tcBorders>
-              <w:bottom w:val="single" w:sz="18" w:space="0" w:color="000000"/>
-            </w:tcBorders>
-          </w:tcPr>
-          <w:p>
-            <w:pPr>
-              <w:widowControl w:val="0"/>
-              <w:spacing w:line="240" w:lineRule="auto"/>
-              <w:rPr>
-                <w:rFonts w:ascii="Garamond" w:eastAsia="Times New Roman" w:hAnsi="Garamond" w:cs="Times New Roman"/>
-              </w:rPr>
-            </w:pPr>
-          </w:p>
-        </w:tc>
-        <w:tc>
-          <w:tcPr>
-            <w:tcW w:w="2880" w:type="dxa"/>
-            <w:vMerge/>
-            <w:tcBorders>
-              <w:bottom w:val="single" w:sz="18" w:space="0" w:color="000000"/>
-              <w:right w:val="nil"/>
-            </w:tcBorders>
-            <w:tcMar>
-              <w:top w:w="100" w:type="dxa"/>
-              <w:left w:w="100" w:type="dxa"/>
-              <w:bottom w:w="100" w:type="dxa"/>
-              <w:right w:w="100" w:type="dxa"/>
-            </w:tcMar>
-          </w:tcPr>
-          <w:p>
-            <w:pPr>
-              <w:widowControl w:val="0"/>
-              <w:spacing w:line="240" w:lineRule="auto"/>
-              <w:rPr>
-                <w:rFonts w:ascii="Garamond" w:eastAsia="Times New Roman" w:hAnsi="Garamond" w:cs="Times New Roman"/>
-              </w:rPr>
-            </w:pPr>
-          </w:p>
-        </w:tc>
-      </w:tr>
-      <w:tr>
-        <w:trPr>
-          <w:trHeight w:val="20"/>
-        </w:trPr>
-        <w:tc>
-          <w:tcPr>
-            <w:tcW w:w="270" w:type="dxa"/>
-            <w:vMerge w:val="restart"/>
-            <w:tcBorders>
-              <w:left w:val="nil"/>
-            </w:tcBorders>
-            <w:tcMar>
-              <w:top w:w="100" w:type="dxa"/>
-              <w:left w:w="100" w:type="dxa"/>
-              <w:bottom w:w="100" w:type="dxa"/>
-              <w:right w:w="100" w:type="dxa"/>
-            </w:tcMar>
-          </w:tcPr>
-          <w:p>
-            <w:pPr>
-              <w:widowControl w:val="0"/>
-              <w:spacing w:line="240" w:lineRule="auto"/>
-              <w:rPr>
-                <w:rFonts w:ascii="Garamond" w:eastAsia="Times New Roman" w:hAnsi="Garamond" w:cs="Times New Roman"/>
-              </w:rPr>
-            </w:pPr>
-            <w:r>
-              <w:rPr>
-                <w:rFonts w:ascii="Garamond" w:eastAsia="Times New Roman" w:hAnsi="Garamond" w:cs="Times New Roman"/>
-              </w:rPr>
-              <w:t>3</w:t>
-            </w:r>
-          </w:p>
-        </w:tc>
-        <w:tc>
-          <w:tcPr>
-            <w:tcW w:w="1020" w:type="dxa"/>
-            <w:tcMar>
-              <w:top w:w="100" w:type="dxa"/>
-              <w:left w:w="100" w:type="dxa"/>
-              <w:bottom w:w="100" w:type="dxa"/>
-              <w:right w:w="100" w:type="dxa"/>
-            </w:tcMar>
-          </w:tcPr>
-          <w:p>
-            <w:pPr>
-              <w:widowControl w:val="0"/>
-              <w:spacing w:line="240" w:lineRule="auto"/>
-              <w:rPr>
-                <w:rFonts w:ascii="Garamond" w:eastAsia="Times New Roman" w:hAnsi="Garamond" w:cs="Times New Roman"/>
-              </w:rPr>
-            </w:pPr>
-            <w:r>
-              <w:rPr>
-                <w:rFonts w:ascii="Garamond" w:eastAsia="Times New Roman" w:hAnsi="Garamond" w:cs="Times New Roman"/>
-              </w:rPr>
-              <w:t>Type</w:t>
-            </w:r>
-          </w:p>
-        </w:tc>
-        <w:tc>
-          <w:tcPr>
-            <w:tcW w:w="1920" w:type="dxa"/>
-            <w:tcMar>
-              <w:top w:w="100" w:type="dxa"/>
-              <w:left w:w="100" w:type="dxa"/>
-              <w:bottom w:w="100" w:type="dxa"/>
-              <w:right w:w="100" w:type="dxa"/>
-            </w:tcMar>
-          </w:tcPr>
-          <w:p>
-            <w:pPr>
-              <w:widowControl w:val="0"/>
-              <w:spacing w:line="240" w:lineRule="auto"/>
-              <w:rPr>
-                <w:rFonts w:ascii="Garamond" w:eastAsia="Times New Roman" w:hAnsi="Garamond" w:cs="Times New Roman"/>
-              </w:rPr>
-            </w:pPr>
-            <w:sdt>
-              <w:sdtPr>
-                <w:rPr>
-                  <w:rFonts w:ascii="Garamond" w:hAnsi="Garamond"/>
-                </w:rPr>
-                <w:alias w:val="Type"/>
-                <w:id w:val="587059919"/>
-                <w:dropDownList>
-                  <w:listItem w:displayText="Select One" w:value="Select One"/>
-                  <w:listItem w:displayText="Study Design" w:value="Study Design"/>
-                  <w:listItem w:displayText="Sample" w:value="Sample"/>
-                  <w:listItem w:displayText="Research Q(s)" w:value="Research Q(s)"/>
-                  <w:listItem w:displayText="Hypotheses" w:value="Hypotheses"/>
-                  <w:listItem w:displayText="Variables" w:value="Variables"/>
-                  <w:listItem w:displayText="Analysis" w:value="Analysis"/>
-                  <w:listItem w:displayText="Covariates" w:value="Covariates"/>
-                  <w:listItem w:displayText="Inferential Criteria" w:value="Inferential Criteria"/>
-                  <w:listItem w:displayText="Data Preparation" w:value="Data Preparation"/>
-                  <w:listItem w:displayText="Other (Please Explain)" w:value="Other (Please Explain)"/>
-                </w:dropDownList>
-              </w:sdtPr>
-              <w:sdtContent>
-                <w:r>
-                  <w:rPr>
-                    <w:rFonts w:ascii="Garamond" w:eastAsia="Times New Roman" w:hAnsi="Garamond" w:cs="Times New Roman"/>
-                  </w:rPr>
-                  <w:t>Select One</w:t>
-                </w:r>
-              </w:sdtContent>
-            </w:sdt>
-          </w:p>
-        </w:tc>
-        <w:tc>
-          <w:tcPr>
-            <w:tcW w:w="4170" w:type="dxa"/>
-            <w:vMerge w:val="restart"/>
-          </w:tcPr>
-          <w:p>
-            <w:pPr>
-              <w:widowControl w:val="0"/>
-              <w:spacing w:line="240" w:lineRule="auto"/>
-              <w:rPr>
-                <w:rFonts w:ascii="Garamond" w:eastAsia="Times New Roman" w:hAnsi="Garamond" w:cs="Times New Roman"/>
-              </w:rPr>
-            </w:pPr>
-          </w:p>
-        </w:tc>
-        <w:tc>
-          <w:tcPr>
-            <w:tcW w:w="4050" w:type="dxa"/>
-            <w:vMerge w:val="restart"/>
-          </w:tcPr>
-          <w:p>
-            <w:pPr>
-              <w:widowControl w:val="0"/>
-              <w:spacing w:line="240" w:lineRule="auto"/>
-              <w:rPr>
-                <w:rFonts w:ascii="Garamond" w:eastAsia="Times New Roman" w:hAnsi="Garamond" w:cs="Times New Roman"/>
-              </w:rPr>
-            </w:pPr>
-          </w:p>
-        </w:tc>
-        <w:tc>
-          <w:tcPr>
-            <w:tcW w:w="2880" w:type="dxa"/>
-            <w:vMerge w:val="restart"/>
-            <w:tcBorders>
-              <w:right w:val="nil"/>
-            </w:tcBorders>
-            <w:tcMar>
-              <w:top w:w="100" w:type="dxa"/>
-              <w:left w:w="100" w:type="dxa"/>
-              <w:bottom w:w="100" w:type="dxa"/>
-              <w:right w:w="100" w:type="dxa"/>
-            </w:tcMar>
-          </w:tcPr>
-          <w:p>
-            <w:pPr>
-              <w:widowControl w:val="0"/>
-              <w:spacing w:line="240" w:lineRule="auto"/>
-              <w:rPr>
-                <w:rFonts w:ascii="Garamond" w:eastAsia="Times New Roman" w:hAnsi="Garamond" w:cs="Times New Roman"/>
-              </w:rPr>
-            </w:pPr>
-          </w:p>
-        </w:tc>
-      </w:tr>
-      <w:tr>
-        <w:trPr>
-          <w:trHeight w:val="20"/>
-        </w:trPr>
-        <w:tc>
-          <w:tcPr>
-            <w:tcW w:w="270" w:type="dxa"/>
-            <w:vMerge/>
-            <w:tcBorders>
-              <w:left w:val="nil"/>
-            </w:tcBorders>
-            <w:tcMar>
-              <w:top w:w="100" w:type="dxa"/>
-              <w:left w:w="100" w:type="dxa"/>
-              <w:bottom w:w="100" w:type="dxa"/>
-              <w:right w:w="100" w:type="dxa"/>
-            </w:tcMar>
-          </w:tcPr>
-          <w:p>
-            <w:pPr>
-              <w:widowControl w:val="0"/>
-              <w:spacing w:line="240" w:lineRule="auto"/>
-              <w:rPr>
-                <w:rFonts w:ascii="Garamond" w:eastAsia="Times New Roman" w:hAnsi="Garamond" w:cs="Times New Roman"/>
-              </w:rPr>
-            </w:pPr>
-          </w:p>
-        </w:tc>
-        <w:tc>
-          <w:tcPr>
-            <w:tcW w:w="1020" w:type="dxa"/>
-            <w:tcMar>
-              <w:top w:w="100" w:type="dxa"/>
-              <w:left w:w="100" w:type="dxa"/>
-              <w:bottom w:w="100" w:type="dxa"/>
-              <w:right w:w="100" w:type="dxa"/>
-            </w:tcMar>
-          </w:tcPr>
-          <w:p>
-            <w:pPr>
-              <w:widowControl w:val="0"/>
-              <w:spacing w:line="240" w:lineRule="auto"/>
-              <w:rPr>
-                <w:rFonts w:ascii="Garamond" w:eastAsia="Times New Roman" w:hAnsi="Garamond" w:cs="Times New Roman"/>
-              </w:rPr>
-            </w:pPr>
-            <w:r>
-              <w:rPr>
-                <w:rFonts w:ascii="Garamond" w:eastAsia="Times New Roman" w:hAnsi="Garamond" w:cs="Times New Roman"/>
-              </w:rPr>
-              <w:t>Reason</w:t>
-            </w:r>
-          </w:p>
-        </w:tc>
-        <w:tc>
-          <w:tcPr>
-            <w:tcW w:w="1920" w:type="dxa"/>
-            <w:tcMar>
-              <w:top w:w="100" w:type="dxa"/>
-              <w:left w:w="100" w:type="dxa"/>
-              <w:bottom w:w="100" w:type="dxa"/>
-              <w:right w:w="100" w:type="dxa"/>
-            </w:tcMar>
-          </w:tcPr>
-          <w:p>
-            <w:pPr>
-              <w:widowControl w:val="0"/>
-              <w:spacing w:line="240" w:lineRule="auto"/>
-              <w:rPr>
-                <w:rFonts w:ascii="Garamond" w:eastAsia="Times New Roman" w:hAnsi="Garamond" w:cs="Times New Roman"/>
-              </w:rPr>
-            </w:pPr>
-            <w:sdt>
-              <w:sdtPr>
-                <w:rPr>
-                  <w:rFonts w:ascii="Garamond" w:hAnsi="Garamond"/>
-                </w:rPr>
-                <w:alias w:val="Reason"/>
-                <w:id w:val="-723578579"/>
-                <w:dropDownList>
-                  <w:listItem w:displayText="Select One" w:value="Select One"/>
-                  <w:listItem w:displayText="Typo/Error" w:value="Typo/Error"/>
-                  <w:listItem w:displayText="Plan not possible" w:value="Plan not possible"/>
-                  <w:listItem w:displayText="New knowledge" w:value="New knowledge"/>
-                  <w:listItem w:displayText="Peer review" w:value="Peer review"/>
-                  <w:listItem w:displayText="Miscommunication" w:value="Miscommunication"/>
-                  <w:listItem w:displayText="Other (Please Explain)" w:value="Other (Please Explain)"/>
-                </w:dropDownList>
-              </w:sdtPr>
-              <w:sdtContent>
-                <w:r>
-                  <w:rPr>
-                    <w:rFonts w:ascii="Garamond" w:eastAsia="Times New Roman" w:hAnsi="Garamond" w:cs="Times New Roman"/>
-                    <w:color w:val="000000"/>
-                    <w:shd w:val="clear" w:color="auto" w:fill="E8EAED"/>
-                  </w:rPr>
-                  <w:t>Select One</w:t>
-                </w:r>
-              </w:sdtContent>
-            </w:sdt>
-          </w:p>
-        </w:tc>
-        <w:tc>
-          <w:tcPr>
-            <w:tcW w:w="4170" w:type="dxa"/>
-            <w:vMerge/>
-          </w:tcPr>
-          <w:p>
-            <w:pPr>
-              <w:widowControl w:val="0"/>
-              <w:spacing w:line="240" w:lineRule="auto"/>
-              <w:rPr>
-                <w:rFonts w:ascii="Garamond" w:eastAsia="Times New Roman" w:hAnsi="Garamond" w:cs="Times New Roman"/>
-              </w:rPr>
-            </w:pPr>
-          </w:p>
-        </w:tc>
-        <w:tc>
-          <w:tcPr>
-            <w:tcW w:w="4050" w:type="dxa"/>
-            <w:vMerge/>
-          </w:tcPr>
-          <w:p>
-            <w:pPr>
-              <w:widowControl w:val="0"/>
-              <w:spacing w:line="240" w:lineRule="auto"/>
-              <w:rPr>
-                <w:rFonts w:ascii="Garamond" w:eastAsia="Times New Roman" w:hAnsi="Garamond" w:cs="Times New Roman"/>
-              </w:rPr>
-            </w:pPr>
-          </w:p>
-        </w:tc>
-        <w:tc>
-          <w:tcPr>
-            <w:tcW w:w="2880" w:type="dxa"/>
-            <w:vMerge/>
-            <w:tcBorders>
-              <w:right w:val="nil"/>
-            </w:tcBorders>
-            <w:tcMar>
-              <w:top w:w="100" w:type="dxa"/>
-              <w:left w:w="100" w:type="dxa"/>
-              <w:bottom w:w="100" w:type="dxa"/>
-              <w:right w:w="100" w:type="dxa"/>
-            </w:tcMar>
-          </w:tcPr>
-          <w:p>
-            <w:pPr>
-              <w:widowControl w:val="0"/>
-              <w:spacing w:line="240" w:lineRule="auto"/>
-              <w:rPr>
-                <w:rFonts w:ascii="Garamond" w:eastAsia="Times New Roman" w:hAnsi="Garamond" w:cs="Times New Roman"/>
-              </w:rPr>
-            </w:pPr>
-          </w:p>
-        </w:tc>
-      </w:tr>
-      <w:tr>
-        <w:trPr>
-          <w:trHeight w:val="20"/>
-        </w:trPr>
-        <w:tc>
-          <w:tcPr>
-            <w:tcW w:w="270" w:type="dxa"/>
-            <w:vMerge/>
-            <w:tcBorders>
-              <w:left w:val="nil"/>
-              <w:bottom w:val="single" w:sz="18" w:space="0" w:color="000000"/>
-            </w:tcBorders>
-            <w:tcMar>
-              <w:top w:w="100" w:type="dxa"/>
-              <w:left w:w="100" w:type="dxa"/>
-              <w:bottom w:w="100" w:type="dxa"/>
-              <w:right w:w="100" w:type="dxa"/>
-            </w:tcMar>
-          </w:tcPr>
-          <w:p>
-            <w:pPr>
-              <w:widowControl w:val="0"/>
-              <w:spacing w:line="240" w:lineRule="auto"/>
-              <w:rPr>
-                <w:rFonts w:ascii="Garamond" w:eastAsia="Times New Roman" w:hAnsi="Garamond" w:cs="Times New Roman"/>
-              </w:rPr>
-            </w:pPr>
-          </w:p>
-        </w:tc>
-        <w:tc>
-          <w:tcPr>
-            <w:tcW w:w="1020" w:type="dxa"/>
-            <w:tcBorders>
-              <w:bottom w:val="single" w:sz="18" w:space="0" w:color="000000"/>
-            </w:tcBorders>
-            <w:tcMar>
-              <w:top w:w="100" w:type="dxa"/>
-              <w:left w:w="100" w:type="dxa"/>
-              <w:bottom w:w="100" w:type="dxa"/>
-              <w:right w:w="100" w:type="dxa"/>
-            </w:tcMar>
-          </w:tcPr>
-          <w:p>
-            <w:pPr>
-              <w:widowControl w:val="0"/>
-              <w:spacing w:line="240" w:lineRule="auto"/>
-              <w:rPr>
-                <w:rFonts w:ascii="Garamond" w:eastAsia="Times New Roman" w:hAnsi="Garamond" w:cs="Times New Roman"/>
-              </w:rPr>
-            </w:pPr>
-            <w:r>
-              <w:rPr>
-                <w:rFonts w:ascii="Garamond" w:eastAsia="Times New Roman" w:hAnsi="Garamond" w:cs="Times New Roman"/>
-              </w:rPr>
-              <w:t>Timing</w:t>
-            </w:r>
-          </w:p>
-        </w:tc>
-        <w:tc>
-          <w:tcPr>
-            <w:tcW w:w="1920" w:type="dxa"/>
-            <w:tcBorders>
-              <w:bottom w:val="single" w:sz="18" w:space="0" w:color="000000"/>
-            </w:tcBorders>
-            <w:tcMar>
-              <w:top w:w="100" w:type="dxa"/>
-              <w:left w:w="100" w:type="dxa"/>
-              <w:bottom w:w="100" w:type="dxa"/>
-              <w:right w:w="100" w:type="dxa"/>
-            </w:tcMar>
-          </w:tcPr>
-          <w:p>
-            <w:pPr>
-              <w:widowControl w:val="0"/>
-              <w:spacing w:line="240" w:lineRule="auto"/>
-              <w:rPr>
-                <w:rFonts w:ascii="Garamond" w:eastAsia="Times New Roman" w:hAnsi="Garamond" w:cs="Times New Roman"/>
-              </w:rPr>
-            </w:pPr>
-            <w:sdt>
-              <w:sdtPr>
-                <w:rPr>
-                  <w:rFonts w:ascii="Garamond" w:hAnsi="Garamond"/>
-                </w:rPr>
-                <w:alias w:val="Timing"/>
-                <w:id w:val="-1007773520"/>
-                <w:dropDownList>
-                  <w:listItem w:displayText="Select One" w:value="Select One"/>
-                  <w:listItem w:displayText="Before data collection" w:value="Before data collection"/>
-                  <w:listItem w:displayText="During data collection" w:value="During data collection"/>
-                  <w:listItem w:displayText="Before data access" w:value="Before data access"/>
-                  <w:listItem w:displayText="After data access" w:value="After data access"/>
-                  <w:listItem w:displayText="After results known" w:value="After results known"/>
-                  <w:listItem w:displayText="Other (Please Explain)" w:value="Other (Please Explain)"/>
-                </w:dropDownList>
-              </w:sdtPr>
-              <w:sdtContent>
-                <w:r>
-                  <w:rPr>
-                    <w:rFonts w:ascii="Garamond" w:eastAsia="Times New Roman" w:hAnsi="Garamond" w:cs="Times New Roman"/>
-                  </w:rPr>
-                  <w:t>Select One</w:t>
-                </w:r>
-              </w:sdtContent>
-            </w:sdt>
-          </w:p>
-        </w:tc>
-        <w:tc>
-          <w:tcPr>
-            <w:tcW w:w="4170" w:type="dxa"/>
-            <w:vMerge/>
-            <w:tcBorders>
-              <w:bottom w:val="single" w:sz="18" w:space="0" w:color="000000"/>
-            </w:tcBorders>
-          </w:tcPr>
-          <w:p>
-            <w:pPr>
-              <w:widowControl w:val="0"/>
-              <w:spacing w:line="240" w:lineRule="auto"/>
-              <w:rPr>
-                <w:rFonts w:ascii="Garamond" w:eastAsia="Times New Roman" w:hAnsi="Garamond" w:cs="Times New Roman"/>
-              </w:rPr>
-            </w:pPr>
-          </w:p>
-        </w:tc>
-        <w:tc>
-          <w:tcPr>
-            <w:tcW w:w="4050" w:type="dxa"/>
-            <w:vMerge/>
-            <w:tcBorders>
-              <w:bottom w:val="single" w:sz="18" w:space="0" w:color="000000"/>
-            </w:tcBorders>
-          </w:tcPr>
-          <w:p>
-            <w:pPr>
-              <w:widowControl w:val="0"/>
-              <w:spacing w:line="240" w:lineRule="auto"/>
-              <w:rPr>
-                <w:rFonts w:ascii="Garamond" w:eastAsia="Times New Roman" w:hAnsi="Garamond" w:cs="Times New Roman"/>
-              </w:rPr>
-            </w:pPr>
-          </w:p>
-        </w:tc>
-        <w:tc>
-          <w:tcPr>
-            <w:tcW w:w="2880" w:type="dxa"/>
-            <w:vMerge/>
-            <w:tcBorders>
-              <w:bottom w:val="single" w:sz="18" w:space="0" w:color="000000"/>
-              <w:right w:val="nil"/>
-            </w:tcBorders>
-            <w:tcMar>
-              <w:top w:w="100" w:type="dxa"/>
-              <w:left w:w="100" w:type="dxa"/>
-              <w:bottom w:w="100" w:type="dxa"/>
-              <w:right w:w="100" w:type="dxa"/>
-            </w:tcMar>
-          </w:tcPr>
-          <w:p>
-            <w:pPr>
-              <w:widowControl w:val="0"/>
-              <w:spacing w:line="240" w:lineRule="auto"/>
-              <w:rPr>
-                <w:rFonts w:ascii="Garamond" w:eastAsia="Times New Roman" w:hAnsi="Garamond" w:cs="Times New Roman"/>
-              </w:rPr>
-            </w:pPr>
+                <w:b/>
+              </w:rPr>
+            </w:pPr>
+            <w:r>
+              <w:rPr>
+                <w:rFonts w:ascii="Garamond" w:eastAsia="Times New Roman" w:hAnsi="Garamond" w:cs="Times New Roman"/>
+                <w:b/>
+              </w:rPr>
+              <w:t>Unregistered Steps</w:t>
+            </w:r>
           </w:p>
         </w:tc>
       </w:tr>
@@ -6168,10 +4242,8 @@
         </w:trPr>
         <w:tc>
           <w:tcPr>
-            <w:tcW w:w="14310" w:type="dxa"/>
-            <w:gridSpan w:val="6"/>
-            <w:tcBorders>
-              <w:top w:val="single" w:sz="18" w:space="0" w:color="000000"/>
+            <w:tcW w:w="270" w:type="dxa"/>
+            <w:tcBorders>
               <w:left w:val="nil"/>
             </w:tcBorders>
             <w:tcMar>
@@ -6187,49 +4259,12 @@
               <w:spacing w:line="240" w:lineRule="auto"/>
               <w:rPr>
                 <w:rFonts w:ascii="Garamond" w:eastAsia="Times New Roman" w:hAnsi="Garamond" w:cs="Times New Roman"/>
-                <w:b/>
-              </w:rPr>
-            </w:pPr>
-            <w:r>
-              <w:rPr>
-                <w:rFonts w:ascii="Garamond" w:eastAsia="Times New Roman" w:hAnsi="Garamond" w:cs="Times New Roman"/>
-                <w:b/>
-              </w:rPr>
-              <w:t>Unregistered Steps</w:t>
-            </w:r>
-          </w:p>
-        </w:tc>
-      </w:tr>
-      <w:tr>
-        <w:trPr>
-          <w:trHeight w:val="440"/>
-        </w:trPr>
-        <w:tc>
-          <w:tcPr>
-            <w:tcW w:w="270" w:type="dxa"/>
-            <w:tcBorders>
-              <w:left w:val="nil"/>
-            </w:tcBorders>
-            <w:tcMar>
-              <w:top w:w="100" w:type="dxa"/>
-              <w:left w:w="100" w:type="dxa"/>
-              <w:bottom w:w="100" w:type="dxa"/>
-              <w:right w:w="100" w:type="dxa"/>
-            </w:tcMar>
-          </w:tcPr>
-          <w:p>
-            <w:pPr>
-              <w:widowControl w:val="0"/>
-              <w:spacing w:line="240" w:lineRule="auto"/>
-              <w:rPr>
-                <w:rFonts w:ascii="Garamond" w:eastAsia="Times New Roman" w:hAnsi="Garamond" w:cs="Times New Roman"/>
-              </w:rPr>
-            </w:pPr>
-            <w:r>
-              <w:rPr>
-                <w:rFonts w:ascii="Garamond" w:eastAsia="Times New Roman" w:hAnsi="Garamond" w:cs="Times New Roman"/>
-              </w:rPr>
-              <w:lastRenderedPageBreak/>
+              </w:rPr>
+            </w:pPr>
+            <w:r>
+              <w:rPr>
+                <w:rFonts w:ascii="Garamond" w:eastAsia="Times New Roman" w:hAnsi="Garamond" w:cs="Times New Roman"/>
+              </w:rPr>
               <w:t>#</w:t>
             </w:r>
           </w:p>
@@ -7223,7 +5258,15 @@
                 <w:rFonts w:ascii="Garamond" w:hAnsi="Garamond"/>
                 <w:color w:val="000000"/>
               </w:rPr>
-              <w:t>), which accounted for 38% of Registered Reports, with all others (Figure 4). One question we wondered about is whether reporting of exploratory research was higher in Registered Reports and preregistration in the three prolific journals compared to the others.”</w:t>
+              <w:t xml:space="preserve">), which accounted for 38% </w:t>
+            </w:r>
+            <w:r>
+              <w:rPr>
+                <w:rFonts w:ascii="Garamond" w:hAnsi="Garamond"/>
+                <w:color w:val="000000"/>
+              </w:rPr>
+              <w:lastRenderedPageBreak/>
+              <w:t>of Registered Reports, with all others (Figure 4). One question we wondered about is whether reporting of exploratory research was higher in Registered Reports and preregistration in the three prolific journals compared to the others.”</w:t>
             </w:r>
           </w:p>
         </w:tc>
@@ -7253,6 +5296,7 @@
               <w:rPr>
                 <w:rFonts w:ascii="Garamond" w:eastAsia="Times New Roman" w:hAnsi="Garamond" w:cs="Times New Roman"/>
               </w:rPr>
+              <w:lastRenderedPageBreak/>
               <w:t xml:space="preserve">No impact: This is an </w:t>
             </w:r>
             <w:r>
@@ -7588,14 +5632,7 @@
               <w:rPr>
                 <w:rFonts w:ascii="Garamond" w:eastAsia="Times New Roman" w:hAnsi="Garamond" w:cs="Times New Roman"/>
               </w:rPr>
-              <w:t xml:space="preserve"> because it is a methods journal that publishes substantive Registered Reports, and we thought it would be difficult to </w:t>
-            </w:r>
-            <w:r>
-              <w:rPr>
-                <w:rFonts w:ascii="Garamond" w:eastAsia="Times New Roman" w:hAnsi="Garamond" w:cs="Times New Roman"/>
-              </w:rPr>
-              <w:lastRenderedPageBreak/>
-              <w:t>locate appropriate matches.</w:t>
+              <w:t xml:space="preserve"> because it is a methods journal that publishes substantive Registered Reports, and we thought it would be difficult to locate appropriate matches.</w:t>
             </w:r>
           </w:p>
         </w:tc>
@@ -7625,7 +5662,6 @@
               <w:rPr>
                 <w:rFonts w:ascii="Garamond" w:eastAsia="Times New Roman" w:hAnsi="Garamond" w:cs="Times New Roman"/>
               </w:rPr>
-              <w:lastRenderedPageBreak/>
               <w:t xml:space="preserve">Minimal impact: This decision reduced the total number of journals included, which was already arbitrary, by one. </w:t>
             </w:r>
           </w:p>
@@ -7786,989 +5822,7 @@
           </w:p>
         </w:tc>
       </w:tr>
-      <w:tr>
-        <w:trPr>
-          <w:trHeight w:val="440"/>
-        </w:trPr>
-        <w:tc>
-          <w:tcPr>
-            <w:tcW w:w="270" w:type="dxa"/>
-            <w:vMerge w:val="restart"/>
-            <w:tcBorders>
-              <w:left w:val="nil"/>
-            </w:tcBorders>
-            <w:tcMar>
-              <w:top w:w="100" w:type="dxa"/>
-              <w:left w:w="100" w:type="dxa"/>
-              <w:bottom w:w="100" w:type="dxa"/>
-              <w:right w:w="100" w:type="dxa"/>
-            </w:tcMar>
-          </w:tcPr>
-          <w:p>
-            <w:pPr>
-              <w:widowControl w:val="0"/>
-              <w:spacing w:line="240" w:lineRule="auto"/>
-              <w:rPr>
-                <w:rFonts w:ascii="Garamond" w:eastAsia="Times New Roman" w:hAnsi="Garamond" w:cs="Times New Roman"/>
-              </w:rPr>
-            </w:pPr>
-            <w:r>
-              <w:rPr>
-                <w:rFonts w:ascii="Garamond" w:eastAsia="Times New Roman" w:hAnsi="Garamond" w:cs="Times New Roman"/>
-              </w:rPr>
-              <w:t>3</w:t>
-            </w:r>
-          </w:p>
-        </w:tc>
-        <w:tc>
-          <w:tcPr>
-            <w:tcW w:w="1020" w:type="dxa"/>
-            <w:tcMar>
-              <w:top w:w="100" w:type="dxa"/>
-              <w:left w:w="100" w:type="dxa"/>
-              <w:bottom w:w="100" w:type="dxa"/>
-              <w:right w:w="100" w:type="dxa"/>
-            </w:tcMar>
-          </w:tcPr>
-          <w:p>
-            <w:pPr>
-              <w:widowControl w:val="0"/>
-              <w:spacing w:line="240" w:lineRule="auto"/>
-              <w:rPr>
-                <w:rFonts w:ascii="Garamond" w:eastAsia="Times New Roman" w:hAnsi="Garamond" w:cs="Times New Roman"/>
-              </w:rPr>
-            </w:pPr>
-            <w:r>
-              <w:rPr>
-                <w:rFonts w:ascii="Garamond" w:eastAsia="Times New Roman" w:hAnsi="Garamond" w:cs="Times New Roman"/>
-              </w:rPr>
-              <w:t>Type</w:t>
-            </w:r>
-          </w:p>
-        </w:tc>
-        <w:tc>
-          <w:tcPr>
-            <w:tcW w:w="1920" w:type="dxa"/>
-            <w:tcMar>
-              <w:top w:w="100" w:type="dxa"/>
-              <w:left w:w="100" w:type="dxa"/>
-              <w:bottom w:w="100" w:type="dxa"/>
-              <w:right w:w="100" w:type="dxa"/>
-            </w:tcMar>
-          </w:tcPr>
-          <w:p>
-            <w:pPr>
-              <w:widowControl w:val="0"/>
-              <w:spacing w:line="240" w:lineRule="auto"/>
-              <w:rPr>
-                <w:rFonts w:ascii="Garamond" w:eastAsia="Times New Roman" w:hAnsi="Garamond" w:cs="Times New Roman"/>
-              </w:rPr>
-            </w:pPr>
-            <w:sdt>
-              <w:sdtPr>
-                <w:rPr>
-                  <w:rFonts w:ascii="Garamond" w:hAnsi="Garamond"/>
-                </w:rPr>
-                <w:alias w:val="Type"/>
-                <w:id w:val="-1397514066"/>
-                <w:dropDownList>
-                  <w:listItem w:displayText="Select One" w:value="Select One"/>
-                  <w:listItem w:displayText="Study Design" w:value="Study Design"/>
-                  <w:listItem w:displayText="Sample" w:value="Sample"/>
-                  <w:listItem w:displayText="Research Q(s)" w:value="Research Q(s)"/>
-                  <w:listItem w:displayText="Hypotheses" w:value="Hypotheses"/>
-                  <w:listItem w:displayText="Variables" w:value="Variables"/>
-                  <w:listItem w:displayText="Analysis" w:value="Analysis"/>
-                  <w:listItem w:displayText="Covariates" w:value="Covariates"/>
-                  <w:listItem w:displayText="Inferential Criteria" w:value="Inferential Criteria"/>
-                  <w:listItem w:displayText="Data Preparation" w:value="Data Preparation"/>
-                  <w:listItem w:displayText="Other (Please Explain)" w:value="Other (Please Explain)"/>
-                </w:dropDownList>
-              </w:sdtPr>
-              <w:sdtContent>
-                <w:r>
-                  <w:rPr>
-                    <w:rFonts w:ascii="Garamond" w:eastAsia="Times New Roman" w:hAnsi="Garamond" w:cs="Times New Roman"/>
-                  </w:rPr>
-                  <w:t>Select One</w:t>
-                </w:r>
-              </w:sdtContent>
-            </w:sdt>
-          </w:p>
-        </w:tc>
-        <w:tc>
-          <w:tcPr>
-            <w:tcW w:w="4170" w:type="dxa"/>
-            <w:vMerge w:val="restart"/>
-          </w:tcPr>
-          <w:p>
-            <w:pPr>
-              <w:widowControl w:val="0"/>
-              <w:spacing w:line="240" w:lineRule="auto"/>
-              <w:rPr>
-                <w:rFonts w:ascii="Garamond" w:eastAsia="Times New Roman" w:hAnsi="Garamond" w:cs="Times New Roman"/>
-              </w:rPr>
-            </w:pPr>
-          </w:p>
-        </w:tc>
-        <w:tc>
-          <w:tcPr>
-            <w:tcW w:w="4050" w:type="dxa"/>
-            <w:vMerge w:val="restart"/>
-          </w:tcPr>
-          <w:p>
-            <w:pPr>
-              <w:widowControl w:val="0"/>
-              <w:spacing w:line="240" w:lineRule="auto"/>
-              <w:rPr>
-                <w:rFonts w:ascii="Garamond" w:eastAsia="Times New Roman" w:hAnsi="Garamond" w:cs="Times New Roman"/>
-              </w:rPr>
-            </w:pPr>
-          </w:p>
-        </w:tc>
-        <w:tc>
-          <w:tcPr>
-            <w:tcW w:w="2880" w:type="dxa"/>
-            <w:vMerge w:val="restart"/>
-            <w:tcBorders>
-              <w:right w:val="nil"/>
-            </w:tcBorders>
-            <w:tcMar>
-              <w:top w:w="100" w:type="dxa"/>
-              <w:left w:w="100" w:type="dxa"/>
-              <w:bottom w:w="100" w:type="dxa"/>
-              <w:right w:w="100" w:type="dxa"/>
-            </w:tcMar>
-          </w:tcPr>
-          <w:p>
-            <w:pPr>
-              <w:widowControl w:val="0"/>
-              <w:spacing w:line="240" w:lineRule="auto"/>
-              <w:rPr>
-                <w:rFonts w:ascii="Garamond" w:eastAsia="Times New Roman" w:hAnsi="Garamond" w:cs="Times New Roman"/>
-              </w:rPr>
-            </w:pPr>
-          </w:p>
-        </w:tc>
-      </w:tr>
-      <w:tr>
-        <w:trPr>
-          <w:trHeight w:val="440"/>
-        </w:trPr>
-        <w:tc>
-          <w:tcPr>
-            <w:tcW w:w="270" w:type="dxa"/>
-            <w:vMerge/>
-            <w:tcBorders>
-              <w:left w:val="nil"/>
-            </w:tcBorders>
-            <w:tcMar>
-              <w:top w:w="100" w:type="dxa"/>
-              <w:left w:w="100" w:type="dxa"/>
-              <w:bottom w:w="100" w:type="dxa"/>
-              <w:right w:w="100" w:type="dxa"/>
-            </w:tcMar>
-          </w:tcPr>
-          <w:p>
-            <w:pPr>
-              <w:widowControl w:val="0"/>
-              <w:spacing w:line="240" w:lineRule="auto"/>
-              <w:rPr>
-                <w:rFonts w:ascii="Garamond" w:eastAsia="Times New Roman" w:hAnsi="Garamond" w:cs="Times New Roman"/>
-              </w:rPr>
-            </w:pPr>
-          </w:p>
-        </w:tc>
-        <w:tc>
-          <w:tcPr>
-            <w:tcW w:w="1020" w:type="dxa"/>
-            <w:tcMar>
-              <w:top w:w="100" w:type="dxa"/>
-              <w:left w:w="100" w:type="dxa"/>
-              <w:bottom w:w="100" w:type="dxa"/>
-              <w:right w:w="100" w:type="dxa"/>
-            </w:tcMar>
-          </w:tcPr>
-          <w:p>
-            <w:pPr>
-              <w:widowControl w:val="0"/>
-              <w:spacing w:line="240" w:lineRule="auto"/>
-              <w:rPr>
-                <w:rFonts w:ascii="Garamond" w:eastAsia="Times New Roman" w:hAnsi="Garamond" w:cs="Times New Roman"/>
-              </w:rPr>
-            </w:pPr>
-            <w:r>
-              <w:rPr>
-                <w:rFonts w:ascii="Garamond" w:eastAsia="Times New Roman" w:hAnsi="Garamond" w:cs="Times New Roman"/>
-              </w:rPr>
-              <w:t>Timing</w:t>
-            </w:r>
-          </w:p>
-        </w:tc>
-        <w:tc>
-          <w:tcPr>
-            <w:tcW w:w="1920" w:type="dxa"/>
-            <w:tcMar>
-              <w:top w:w="100" w:type="dxa"/>
-              <w:left w:w="100" w:type="dxa"/>
-              <w:bottom w:w="100" w:type="dxa"/>
-              <w:right w:w="100" w:type="dxa"/>
-            </w:tcMar>
-          </w:tcPr>
-          <w:p>
-            <w:pPr>
-              <w:widowControl w:val="0"/>
-              <w:spacing w:line="240" w:lineRule="auto"/>
-              <w:rPr>
-                <w:rFonts w:ascii="Garamond" w:eastAsia="Times New Roman" w:hAnsi="Garamond" w:cs="Times New Roman"/>
-              </w:rPr>
-            </w:pPr>
-            <w:sdt>
-              <w:sdtPr>
-                <w:rPr>
-                  <w:rFonts w:ascii="Garamond" w:hAnsi="Garamond"/>
-                </w:rPr>
-                <w:alias w:val="Timing"/>
-                <w:id w:val="-1832122250"/>
-                <w:dropDownList>
-                  <w:listItem w:displayText="Select One" w:value="Select One"/>
-                  <w:listItem w:displayText="Before data collection" w:value="Before data collection"/>
-                  <w:listItem w:displayText="During data collection" w:value="During data collection"/>
-                  <w:listItem w:displayText="Before data access" w:value="Before data access"/>
-                  <w:listItem w:displayText="After data access" w:value="After data access"/>
-                  <w:listItem w:displayText="After results known" w:value="After results known"/>
-                  <w:listItem w:displayText="Other (Please Explain)" w:value="Other (Please Explain)"/>
-                </w:dropDownList>
-              </w:sdtPr>
-              <w:sdtContent>
-                <w:r>
-                  <w:rPr>
-                    <w:rFonts w:ascii="Garamond" w:eastAsia="Times New Roman" w:hAnsi="Garamond" w:cs="Times New Roman"/>
-                  </w:rPr>
-                  <w:t>Select One</w:t>
-                </w:r>
-              </w:sdtContent>
-            </w:sdt>
-          </w:p>
-        </w:tc>
-        <w:tc>
-          <w:tcPr>
-            <w:tcW w:w="4170" w:type="dxa"/>
-            <w:vMerge/>
-          </w:tcPr>
-          <w:p>
-            <w:pPr>
-              <w:widowControl w:val="0"/>
-              <w:spacing w:line="240" w:lineRule="auto"/>
-              <w:rPr>
-                <w:rFonts w:ascii="Garamond" w:eastAsia="Times New Roman" w:hAnsi="Garamond" w:cs="Times New Roman"/>
-              </w:rPr>
-            </w:pPr>
-          </w:p>
-        </w:tc>
-        <w:tc>
-          <w:tcPr>
-            <w:tcW w:w="4050" w:type="dxa"/>
-            <w:vMerge/>
-          </w:tcPr>
-          <w:p>
-            <w:pPr>
-              <w:widowControl w:val="0"/>
-              <w:spacing w:line="240" w:lineRule="auto"/>
-              <w:rPr>
-                <w:rFonts w:ascii="Garamond" w:eastAsia="Times New Roman" w:hAnsi="Garamond" w:cs="Times New Roman"/>
-              </w:rPr>
-            </w:pPr>
-          </w:p>
-        </w:tc>
-        <w:tc>
-          <w:tcPr>
-            <w:tcW w:w="2880" w:type="dxa"/>
-            <w:vMerge/>
-            <w:tcBorders>
-              <w:right w:val="nil"/>
-            </w:tcBorders>
-            <w:tcMar>
-              <w:top w:w="100" w:type="dxa"/>
-              <w:left w:w="100" w:type="dxa"/>
-              <w:bottom w:w="100" w:type="dxa"/>
-              <w:right w:w="100" w:type="dxa"/>
-            </w:tcMar>
-          </w:tcPr>
-          <w:p>
-            <w:pPr>
-              <w:widowControl w:val="0"/>
-              <w:spacing w:line="240" w:lineRule="auto"/>
-              <w:rPr>
-                <w:rFonts w:ascii="Garamond" w:eastAsia="Times New Roman" w:hAnsi="Garamond" w:cs="Times New Roman"/>
-              </w:rPr>
-            </w:pPr>
-          </w:p>
-        </w:tc>
-      </w:tr>
-      <w:tr>
-        <w:trPr>
-          <w:trHeight w:val="440"/>
-        </w:trPr>
-        <w:tc>
-          <w:tcPr>
-            <w:tcW w:w="270" w:type="dxa"/>
-            <w:vMerge w:val="restart"/>
-            <w:tcBorders>
-              <w:left w:val="nil"/>
-            </w:tcBorders>
-            <w:tcMar>
-              <w:top w:w="100" w:type="dxa"/>
-              <w:left w:w="100" w:type="dxa"/>
-              <w:bottom w:w="100" w:type="dxa"/>
-              <w:right w:w="100" w:type="dxa"/>
-            </w:tcMar>
-          </w:tcPr>
-          <w:p>
-            <w:pPr>
-              <w:widowControl w:val="0"/>
-              <w:spacing w:line="240" w:lineRule="auto"/>
-              <w:rPr>
-                <w:rFonts w:ascii="Garamond" w:eastAsia="Times New Roman" w:hAnsi="Garamond" w:cs="Times New Roman"/>
-              </w:rPr>
-            </w:pPr>
-            <w:r>
-              <w:rPr>
-                <w:rFonts w:ascii="Garamond" w:eastAsia="Times New Roman" w:hAnsi="Garamond" w:cs="Times New Roman"/>
-              </w:rPr>
-              <w:t>3</w:t>
-            </w:r>
-          </w:p>
-        </w:tc>
-        <w:tc>
-          <w:tcPr>
-            <w:tcW w:w="1020" w:type="dxa"/>
-            <w:tcMar>
-              <w:top w:w="100" w:type="dxa"/>
-              <w:left w:w="100" w:type="dxa"/>
-              <w:bottom w:w="100" w:type="dxa"/>
-              <w:right w:w="100" w:type="dxa"/>
-            </w:tcMar>
-          </w:tcPr>
-          <w:p>
-            <w:pPr>
-              <w:widowControl w:val="0"/>
-              <w:spacing w:line="240" w:lineRule="auto"/>
-              <w:rPr>
-                <w:rFonts w:ascii="Garamond" w:eastAsia="Times New Roman" w:hAnsi="Garamond" w:cs="Times New Roman"/>
-              </w:rPr>
-            </w:pPr>
-            <w:r>
-              <w:rPr>
-                <w:rFonts w:ascii="Garamond" w:eastAsia="Times New Roman" w:hAnsi="Garamond" w:cs="Times New Roman"/>
-              </w:rPr>
-              <w:t>Type</w:t>
-            </w:r>
-          </w:p>
-        </w:tc>
-        <w:tc>
-          <w:tcPr>
-            <w:tcW w:w="1920" w:type="dxa"/>
-            <w:tcMar>
-              <w:top w:w="100" w:type="dxa"/>
-              <w:left w:w="100" w:type="dxa"/>
-              <w:bottom w:w="100" w:type="dxa"/>
-              <w:right w:w="100" w:type="dxa"/>
-            </w:tcMar>
-          </w:tcPr>
-          <w:p>
-            <w:pPr>
-              <w:widowControl w:val="0"/>
-              <w:spacing w:line="240" w:lineRule="auto"/>
-              <w:rPr>
-                <w:rFonts w:ascii="Garamond" w:eastAsia="Times New Roman" w:hAnsi="Garamond" w:cs="Times New Roman"/>
-              </w:rPr>
-            </w:pPr>
-            <w:sdt>
-              <w:sdtPr>
-                <w:rPr>
-                  <w:rFonts w:ascii="Garamond" w:hAnsi="Garamond"/>
-                </w:rPr>
-                <w:alias w:val="Type"/>
-                <w:id w:val="1150398525"/>
-                <w:dropDownList>
-                  <w:listItem w:displayText="Select One" w:value="Select One"/>
-                  <w:listItem w:displayText="Study Design" w:value="Study Design"/>
-                  <w:listItem w:displayText="Sample" w:value="Sample"/>
-                  <w:listItem w:displayText="Research Q(s)" w:value="Research Q(s)"/>
-                  <w:listItem w:displayText="Hypotheses" w:value="Hypotheses"/>
-                  <w:listItem w:displayText="Variables" w:value="Variables"/>
-                  <w:listItem w:displayText="Analysis" w:value="Analysis"/>
-                  <w:listItem w:displayText="Covariates" w:value="Covariates"/>
-                  <w:listItem w:displayText="Inferential Criteria" w:value="Inferential Criteria"/>
-                  <w:listItem w:displayText="Data Preparation" w:value="Data Preparation"/>
-                  <w:listItem w:displayText="Other (Please Explain)" w:value="Other (Please Explain)"/>
-                </w:dropDownList>
-              </w:sdtPr>
-              <w:sdtContent>
-                <w:r>
-                  <w:rPr>
-                    <w:rFonts w:ascii="Garamond" w:eastAsia="Times New Roman" w:hAnsi="Garamond" w:cs="Times New Roman"/>
-                  </w:rPr>
-                  <w:t>Select One</w:t>
-                </w:r>
-              </w:sdtContent>
-            </w:sdt>
-          </w:p>
-        </w:tc>
-        <w:tc>
-          <w:tcPr>
-            <w:tcW w:w="4170" w:type="dxa"/>
-            <w:vMerge w:val="restart"/>
-          </w:tcPr>
-          <w:p>
-            <w:pPr>
-              <w:widowControl w:val="0"/>
-              <w:spacing w:line="240" w:lineRule="auto"/>
-              <w:rPr>
-                <w:rFonts w:ascii="Garamond" w:eastAsia="Times New Roman" w:hAnsi="Garamond" w:cs="Times New Roman"/>
-              </w:rPr>
-            </w:pPr>
-          </w:p>
-        </w:tc>
-        <w:tc>
-          <w:tcPr>
-            <w:tcW w:w="4050" w:type="dxa"/>
-            <w:vMerge w:val="restart"/>
-          </w:tcPr>
-          <w:p>
-            <w:pPr>
-              <w:widowControl w:val="0"/>
-              <w:spacing w:line="240" w:lineRule="auto"/>
-              <w:rPr>
-                <w:rFonts w:ascii="Garamond" w:eastAsia="Times New Roman" w:hAnsi="Garamond" w:cs="Times New Roman"/>
-              </w:rPr>
-            </w:pPr>
-          </w:p>
-        </w:tc>
-        <w:tc>
-          <w:tcPr>
-            <w:tcW w:w="2880" w:type="dxa"/>
-            <w:vMerge w:val="restart"/>
-            <w:tcBorders>
-              <w:right w:val="nil"/>
-            </w:tcBorders>
-            <w:tcMar>
-              <w:top w:w="100" w:type="dxa"/>
-              <w:left w:w="100" w:type="dxa"/>
-              <w:bottom w:w="100" w:type="dxa"/>
-              <w:right w:w="100" w:type="dxa"/>
-            </w:tcMar>
-          </w:tcPr>
-          <w:p>
-            <w:pPr>
-              <w:widowControl w:val="0"/>
-              <w:spacing w:line="240" w:lineRule="auto"/>
-              <w:rPr>
-                <w:rFonts w:ascii="Garamond" w:eastAsia="Times New Roman" w:hAnsi="Garamond" w:cs="Times New Roman"/>
-              </w:rPr>
-            </w:pPr>
-          </w:p>
-        </w:tc>
-      </w:tr>
-      <w:tr>
-        <w:trPr>
-          <w:trHeight w:val="440"/>
-        </w:trPr>
-        <w:tc>
-          <w:tcPr>
-            <w:tcW w:w="270" w:type="dxa"/>
-            <w:vMerge/>
-            <w:tcBorders>
-              <w:left w:val="nil"/>
-            </w:tcBorders>
-            <w:tcMar>
-              <w:top w:w="100" w:type="dxa"/>
-              <w:left w:w="100" w:type="dxa"/>
-              <w:bottom w:w="100" w:type="dxa"/>
-              <w:right w:w="100" w:type="dxa"/>
-            </w:tcMar>
-          </w:tcPr>
-          <w:p>
-            <w:pPr>
-              <w:widowControl w:val="0"/>
-              <w:spacing w:line="240" w:lineRule="auto"/>
-              <w:rPr>
-                <w:rFonts w:ascii="Garamond" w:eastAsia="Times New Roman" w:hAnsi="Garamond" w:cs="Times New Roman"/>
-              </w:rPr>
-            </w:pPr>
-          </w:p>
-        </w:tc>
-        <w:tc>
-          <w:tcPr>
-            <w:tcW w:w="1020" w:type="dxa"/>
-            <w:tcMar>
-              <w:top w:w="100" w:type="dxa"/>
-              <w:left w:w="100" w:type="dxa"/>
-              <w:bottom w:w="100" w:type="dxa"/>
-              <w:right w:w="100" w:type="dxa"/>
-            </w:tcMar>
-          </w:tcPr>
-          <w:p>
-            <w:pPr>
-              <w:widowControl w:val="0"/>
-              <w:spacing w:line="240" w:lineRule="auto"/>
-              <w:rPr>
-                <w:rFonts w:ascii="Garamond" w:eastAsia="Times New Roman" w:hAnsi="Garamond" w:cs="Times New Roman"/>
-              </w:rPr>
-            </w:pPr>
-            <w:r>
-              <w:rPr>
-                <w:rFonts w:ascii="Garamond" w:eastAsia="Times New Roman" w:hAnsi="Garamond" w:cs="Times New Roman"/>
-              </w:rPr>
-              <w:t>Timing</w:t>
-            </w:r>
-          </w:p>
-        </w:tc>
-        <w:tc>
-          <w:tcPr>
-            <w:tcW w:w="1920" w:type="dxa"/>
-            <w:tcMar>
-              <w:top w:w="100" w:type="dxa"/>
-              <w:left w:w="100" w:type="dxa"/>
-              <w:bottom w:w="100" w:type="dxa"/>
-              <w:right w:w="100" w:type="dxa"/>
-            </w:tcMar>
-          </w:tcPr>
-          <w:p>
-            <w:pPr>
-              <w:widowControl w:val="0"/>
-              <w:spacing w:line="240" w:lineRule="auto"/>
-              <w:rPr>
-                <w:rFonts w:ascii="Garamond" w:eastAsia="Times New Roman" w:hAnsi="Garamond" w:cs="Times New Roman"/>
-              </w:rPr>
-            </w:pPr>
-            <w:sdt>
-              <w:sdtPr>
-                <w:rPr>
-                  <w:rFonts w:ascii="Garamond" w:hAnsi="Garamond"/>
-                </w:rPr>
-                <w:alias w:val="Timing"/>
-                <w:id w:val="1739051344"/>
-                <w:dropDownList>
-                  <w:listItem w:displayText="Select One" w:value="Select One"/>
-                  <w:listItem w:displayText="Before data collection" w:value="Before data collection"/>
-                  <w:listItem w:displayText="During data collection" w:value="During data collection"/>
-                  <w:listItem w:displayText="Before data access" w:value="Before data access"/>
-                  <w:listItem w:displayText="After data access" w:value="After data access"/>
-                  <w:listItem w:displayText="After results known" w:value="After results known"/>
-                  <w:listItem w:displayText="Other (Please Explain)" w:value="Other (Please Explain)"/>
-                </w:dropDownList>
-              </w:sdtPr>
-              <w:sdtContent>
-                <w:r>
-                  <w:rPr>
-                    <w:rFonts w:ascii="Garamond" w:eastAsia="Times New Roman" w:hAnsi="Garamond" w:cs="Times New Roman"/>
-                  </w:rPr>
-                  <w:t>Select One</w:t>
-                </w:r>
-              </w:sdtContent>
-            </w:sdt>
-          </w:p>
-        </w:tc>
-        <w:tc>
-          <w:tcPr>
-            <w:tcW w:w="4170" w:type="dxa"/>
-            <w:vMerge/>
-          </w:tcPr>
-          <w:p>
-            <w:pPr>
-              <w:widowControl w:val="0"/>
-              <w:spacing w:line="240" w:lineRule="auto"/>
-              <w:rPr>
-                <w:rFonts w:ascii="Garamond" w:eastAsia="Times New Roman" w:hAnsi="Garamond" w:cs="Times New Roman"/>
-              </w:rPr>
-            </w:pPr>
-          </w:p>
-        </w:tc>
-        <w:tc>
-          <w:tcPr>
-            <w:tcW w:w="4050" w:type="dxa"/>
-            <w:vMerge/>
-          </w:tcPr>
-          <w:p>
-            <w:pPr>
-              <w:widowControl w:val="0"/>
-              <w:spacing w:line="240" w:lineRule="auto"/>
-              <w:rPr>
-                <w:rFonts w:ascii="Garamond" w:eastAsia="Times New Roman" w:hAnsi="Garamond" w:cs="Times New Roman"/>
-              </w:rPr>
-            </w:pPr>
-          </w:p>
-        </w:tc>
-        <w:tc>
-          <w:tcPr>
-            <w:tcW w:w="2880" w:type="dxa"/>
-            <w:vMerge/>
-            <w:tcBorders>
-              <w:right w:val="nil"/>
-            </w:tcBorders>
-            <w:tcMar>
-              <w:top w:w="100" w:type="dxa"/>
-              <w:left w:w="100" w:type="dxa"/>
-              <w:bottom w:w="100" w:type="dxa"/>
-              <w:right w:w="100" w:type="dxa"/>
-            </w:tcMar>
-          </w:tcPr>
-          <w:p>
-            <w:pPr>
-              <w:widowControl w:val="0"/>
-              <w:spacing w:line="240" w:lineRule="auto"/>
-              <w:rPr>
-                <w:rFonts w:ascii="Garamond" w:eastAsia="Times New Roman" w:hAnsi="Garamond" w:cs="Times New Roman"/>
-              </w:rPr>
-            </w:pPr>
-          </w:p>
-        </w:tc>
-      </w:tr>
-      <w:tr>
-        <w:trPr>
-          <w:trHeight w:val="440"/>
-        </w:trPr>
-        <w:tc>
-          <w:tcPr>
-            <w:tcW w:w="270" w:type="dxa"/>
-            <w:vMerge w:val="restart"/>
-            <w:tcBorders>
-              <w:left w:val="nil"/>
-            </w:tcBorders>
-            <w:tcMar>
-              <w:top w:w="100" w:type="dxa"/>
-              <w:left w:w="100" w:type="dxa"/>
-              <w:bottom w:w="100" w:type="dxa"/>
-              <w:right w:w="100" w:type="dxa"/>
-            </w:tcMar>
-          </w:tcPr>
-          <w:p>
-            <w:pPr>
-              <w:widowControl w:val="0"/>
-              <w:spacing w:line="240" w:lineRule="auto"/>
-              <w:rPr>
-                <w:rFonts w:ascii="Garamond" w:eastAsia="Times New Roman" w:hAnsi="Garamond" w:cs="Times New Roman"/>
-              </w:rPr>
-            </w:pPr>
-            <w:r>
-              <w:rPr>
-                <w:rFonts w:ascii="Garamond" w:eastAsia="Times New Roman" w:hAnsi="Garamond" w:cs="Times New Roman"/>
-              </w:rPr>
-              <w:t>3</w:t>
-            </w:r>
-          </w:p>
-        </w:tc>
-        <w:tc>
-          <w:tcPr>
-            <w:tcW w:w="1020" w:type="dxa"/>
-            <w:tcMar>
-              <w:top w:w="100" w:type="dxa"/>
-              <w:left w:w="100" w:type="dxa"/>
-              <w:bottom w:w="100" w:type="dxa"/>
-              <w:right w:w="100" w:type="dxa"/>
-            </w:tcMar>
-          </w:tcPr>
-          <w:p>
-            <w:pPr>
-              <w:widowControl w:val="0"/>
-              <w:spacing w:line="240" w:lineRule="auto"/>
-              <w:rPr>
-                <w:rFonts w:ascii="Garamond" w:eastAsia="Times New Roman" w:hAnsi="Garamond" w:cs="Times New Roman"/>
-              </w:rPr>
-            </w:pPr>
-            <w:r>
-              <w:rPr>
-                <w:rFonts w:ascii="Garamond" w:eastAsia="Times New Roman" w:hAnsi="Garamond" w:cs="Times New Roman"/>
-              </w:rPr>
-              <w:t>Type</w:t>
-            </w:r>
-          </w:p>
-        </w:tc>
-        <w:tc>
-          <w:tcPr>
-            <w:tcW w:w="1920" w:type="dxa"/>
-            <w:tcMar>
-              <w:top w:w="100" w:type="dxa"/>
-              <w:left w:w="100" w:type="dxa"/>
-              <w:bottom w:w="100" w:type="dxa"/>
-              <w:right w:w="100" w:type="dxa"/>
-            </w:tcMar>
-          </w:tcPr>
-          <w:p>
-            <w:pPr>
-              <w:widowControl w:val="0"/>
-              <w:spacing w:line="240" w:lineRule="auto"/>
-              <w:rPr>
-                <w:rFonts w:ascii="Garamond" w:eastAsia="Times New Roman" w:hAnsi="Garamond" w:cs="Times New Roman"/>
-              </w:rPr>
-            </w:pPr>
-            <w:sdt>
-              <w:sdtPr>
-                <w:rPr>
-                  <w:rFonts w:ascii="Garamond" w:hAnsi="Garamond"/>
-                </w:rPr>
-                <w:alias w:val="Type"/>
-                <w:id w:val="1216258379"/>
-                <w:dropDownList>
-                  <w:listItem w:displayText="Select One" w:value="Select One"/>
-                  <w:listItem w:displayText="Study Design" w:value="Study Design"/>
-                  <w:listItem w:displayText="Sample" w:value="Sample"/>
-                  <w:listItem w:displayText="Research Q(s)" w:value="Research Q(s)"/>
-                  <w:listItem w:displayText="Hypotheses" w:value="Hypotheses"/>
-                  <w:listItem w:displayText="Variables" w:value="Variables"/>
-                  <w:listItem w:displayText="Analysis" w:value="Analysis"/>
-                  <w:listItem w:displayText="Covariates" w:value="Covariates"/>
-                  <w:listItem w:displayText="Inferential Criteria" w:value="Inferential Criteria"/>
-                  <w:listItem w:displayText="Data Preparation" w:value="Data Preparation"/>
-                  <w:listItem w:displayText="Other (Please Explain)" w:value="Other (Please Explain)"/>
-                </w:dropDownList>
-              </w:sdtPr>
-              <w:sdtContent>
-                <w:r>
-                  <w:rPr>
-                    <w:rFonts w:ascii="Garamond" w:eastAsia="Times New Roman" w:hAnsi="Garamond" w:cs="Times New Roman"/>
-                  </w:rPr>
-                  <w:t>Select One</w:t>
-                </w:r>
-              </w:sdtContent>
-            </w:sdt>
-          </w:p>
-        </w:tc>
-        <w:tc>
-          <w:tcPr>
-            <w:tcW w:w="4170" w:type="dxa"/>
-            <w:vMerge w:val="restart"/>
-          </w:tcPr>
-          <w:p>
-            <w:pPr>
-              <w:widowControl w:val="0"/>
-              <w:spacing w:line="240" w:lineRule="auto"/>
-              <w:rPr>
-                <w:rFonts w:ascii="Garamond" w:eastAsia="Times New Roman" w:hAnsi="Garamond" w:cs="Times New Roman"/>
-              </w:rPr>
-            </w:pPr>
-          </w:p>
-        </w:tc>
-        <w:tc>
-          <w:tcPr>
-            <w:tcW w:w="4050" w:type="dxa"/>
-            <w:vMerge w:val="restart"/>
-          </w:tcPr>
-          <w:p>
-            <w:pPr>
-              <w:widowControl w:val="0"/>
-              <w:spacing w:line="240" w:lineRule="auto"/>
-              <w:rPr>
-                <w:rFonts w:ascii="Garamond" w:eastAsia="Times New Roman" w:hAnsi="Garamond" w:cs="Times New Roman"/>
-              </w:rPr>
-            </w:pPr>
-          </w:p>
-        </w:tc>
-        <w:tc>
-          <w:tcPr>
-            <w:tcW w:w="2880" w:type="dxa"/>
-            <w:vMerge w:val="restart"/>
-            <w:tcBorders>
-              <w:right w:val="nil"/>
-            </w:tcBorders>
-            <w:tcMar>
-              <w:top w:w="100" w:type="dxa"/>
-              <w:left w:w="100" w:type="dxa"/>
-              <w:bottom w:w="100" w:type="dxa"/>
-              <w:right w:w="100" w:type="dxa"/>
-            </w:tcMar>
-          </w:tcPr>
-          <w:p>
-            <w:pPr>
-              <w:widowControl w:val="0"/>
-              <w:spacing w:line="240" w:lineRule="auto"/>
-              <w:rPr>
-                <w:rFonts w:ascii="Garamond" w:eastAsia="Times New Roman" w:hAnsi="Garamond" w:cs="Times New Roman"/>
-              </w:rPr>
-            </w:pPr>
-          </w:p>
-        </w:tc>
-      </w:tr>
-      <w:tr>
-        <w:trPr>
-          <w:trHeight w:val="440"/>
-        </w:trPr>
-        <w:tc>
-          <w:tcPr>
-            <w:tcW w:w="270" w:type="dxa"/>
-            <w:vMerge/>
-            <w:tcBorders>
-              <w:left w:val="nil"/>
-            </w:tcBorders>
-            <w:tcMar>
-              <w:top w:w="100" w:type="dxa"/>
-              <w:left w:w="100" w:type="dxa"/>
-              <w:bottom w:w="100" w:type="dxa"/>
-              <w:right w:w="100" w:type="dxa"/>
-            </w:tcMar>
-          </w:tcPr>
-          <w:p>
-            <w:pPr>
-              <w:widowControl w:val="0"/>
-              <w:spacing w:line="240" w:lineRule="auto"/>
-              <w:rPr>
-                <w:rFonts w:ascii="Garamond" w:eastAsia="Times New Roman" w:hAnsi="Garamond" w:cs="Times New Roman"/>
-              </w:rPr>
-            </w:pPr>
-          </w:p>
-        </w:tc>
-        <w:tc>
-          <w:tcPr>
-            <w:tcW w:w="1020" w:type="dxa"/>
-            <w:tcMar>
-              <w:top w:w="100" w:type="dxa"/>
-              <w:left w:w="100" w:type="dxa"/>
-              <w:bottom w:w="100" w:type="dxa"/>
-              <w:right w:w="100" w:type="dxa"/>
-            </w:tcMar>
-          </w:tcPr>
-          <w:p>
-            <w:pPr>
-              <w:widowControl w:val="0"/>
-              <w:spacing w:line="240" w:lineRule="auto"/>
-              <w:rPr>
-                <w:rFonts w:ascii="Garamond" w:eastAsia="Times New Roman" w:hAnsi="Garamond" w:cs="Times New Roman"/>
-              </w:rPr>
-            </w:pPr>
-            <w:r>
-              <w:rPr>
-                <w:rFonts w:ascii="Garamond" w:eastAsia="Times New Roman" w:hAnsi="Garamond" w:cs="Times New Roman"/>
-              </w:rPr>
-              <w:t>Timing</w:t>
-            </w:r>
-          </w:p>
-        </w:tc>
-        <w:tc>
-          <w:tcPr>
-            <w:tcW w:w="1920" w:type="dxa"/>
-            <w:tcMar>
-              <w:top w:w="100" w:type="dxa"/>
-              <w:left w:w="100" w:type="dxa"/>
-              <w:bottom w:w="100" w:type="dxa"/>
-              <w:right w:w="100" w:type="dxa"/>
-            </w:tcMar>
-          </w:tcPr>
-          <w:p>
-            <w:pPr>
-              <w:widowControl w:val="0"/>
-              <w:spacing w:line="240" w:lineRule="auto"/>
-              <w:rPr>
-                <w:rFonts w:ascii="Garamond" w:eastAsia="Times New Roman" w:hAnsi="Garamond" w:cs="Times New Roman"/>
-              </w:rPr>
-            </w:pPr>
-            <w:sdt>
-              <w:sdtPr>
-                <w:rPr>
-                  <w:rFonts w:ascii="Garamond" w:hAnsi="Garamond"/>
-                </w:rPr>
-                <w:alias w:val="Timing"/>
-                <w:id w:val="-1400154460"/>
-                <w:dropDownList>
-                  <w:listItem w:displayText="Select One" w:value="Select One"/>
-                  <w:listItem w:displayText="Before data collection" w:value="Before data collection"/>
-                  <w:listItem w:displayText="During data collection" w:value="During data collection"/>
-                  <w:listItem w:displayText="Before data access" w:value="Before data access"/>
-                  <w:listItem w:displayText="After data access" w:value="After data access"/>
-                  <w:listItem w:displayText="After results known" w:value="After results known"/>
-                  <w:listItem w:displayText="Other (Please Explain)" w:value="Other (Please Explain)"/>
-                </w:dropDownList>
-              </w:sdtPr>
-              <w:sdtContent>
-                <w:r>
-                  <w:rPr>
-                    <w:rFonts w:ascii="Garamond" w:eastAsia="Times New Roman" w:hAnsi="Garamond" w:cs="Times New Roman"/>
-                  </w:rPr>
-                  <w:t>Select One</w:t>
-                </w:r>
-              </w:sdtContent>
-            </w:sdt>
-          </w:p>
-        </w:tc>
-        <w:tc>
-          <w:tcPr>
-            <w:tcW w:w="4170" w:type="dxa"/>
-            <w:vMerge/>
-          </w:tcPr>
-          <w:p>
-            <w:pPr>
-              <w:widowControl w:val="0"/>
-              <w:spacing w:line="240" w:lineRule="auto"/>
-              <w:rPr>
-                <w:rFonts w:ascii="Garamond" w:eastAsia="Times New Roman" w:hAnsi="Garamond" w:cs="Times New Roman"/>
-              </w:rPr>
-            </w:pPr>
-          </w:p>
-        </w:tc>
-        <w:tc>
-          <w:tcPr>
-            <w:tcW w:w="4050" w:type="dxa"/>
-            <w:vMerge/>
-          </w:tcPr>
-          <w:p>
-            <w:pPr>
-              <w:widowControl w:val="0"/>
-              <w:spacing w:line="240" w:lineRule="auto"/>
-              <w:rPr>
-                <w:rFonts w:ascii="Garamond" w:eastAsia="Times New Roman" w:hAnsi="Garamond" w:cs="Times New Roman"/>
-              </w:rPr>
-            </w:pPr>
-          </w:p>
-        </w:tc>
-        <w:tc>
-          <w:tcPr>
-            <w:tcW w:w="2880" w:type="dxa"/>
-            <w:vMerge/>
-            <w:tcBorders>
-              <w:right w:val="nil"/>
-            </w:tcBorders>
-            <w:tcMar>
-              <w:top w:w="100" w:type="dxa"/>
-              <w:left w:w="100" w:type="dxa"/>
-              <w:bottom w:w="100" w:type="dxa"/>
-              <w:right w:w="100" w:type="dxa"/>
-            </w:tcMar>
-          </w:tcPr>
-          <w:p>
-            <w:pPr>
-              <w:widowControl w:val="0"/>
-              <w:spacing w:line="240" w:lineRule="auto"/>
-              <w:rPr>
-                <w:rFonts w:ascii="Garamond" w:eastAsia="Times New Roman" w:hAnsi="Garamond" w:cs="Times New Roman"/>
-              </w:rPr>
-            </w:pPr>
-          </w:p>
-        </w:tc>
-      </w:tr>
     </w:tbl>
-    <w:p>
-      <w:pPr>
-        <w:widowControl w:val="0"/>
-        <w:spacing w:line="240" w:lineRule="auto"/>
-        <w:rPr>
-          <w:rFonts w:ascii="Garamond" w:eastAsia="Times New Roman" w:hAnsi="Garamond" w:cs="Times New Roman"/>
-        </w:rPr>
-      </w:pPr>
-      <w:r>
-        <w:rPr>
-          <w:rFonts w:ascii="Garamond" w:eastAsia="Times New Roman" w:hAnsi="Garamond" w:cs="Times New Roman"/>
-          <w:i/>
-        </w:rPr>
-        <w:t xml:space="preserve">Note. </w:t>
-      </w:r>
-      <w:r>
-        <w:rPr>
-          <w:rFonts w:ascii="Garamond" w:eastAsia="Times New Roman" w:hAnsi="Garamond" w:cs="Times New Roman"/>
-        </w:rPr>
-        <w:t xml:space="preserve">Choose one characteristic for each dropdown menu. If more than one type or reason apply to the same deviation, then replace the dropdown menu with details. Provide one deviation per row, and add or delete rows as needed. </w:t>
-      </w:r>
-    </w:p>
     <w:p>
       <w:pPr>
         <w:spacing w:line="240" w:lineRule="auto"/>
@@ -9208,6 +6262,7 @@
   <w:style w:type="character" w:default="1" w:styleId="DefaultParagraphFont">
     <w:name w:val="Default Paragraph Font"/>
     <w:uiPriority w:val="1"/>
+    <w:semiHidden/>
     <w:unhideWhenUsed/>
   </w:style>
   <w:style w:type="table" w:default="1" w:styleId="TableNormal">

</xml_diff>